<commit_message>
Script de windows practica 8
</commit_message>
<xml_diff>
--- a/Documentacion/PDFs/Tarea6.docx
+++ b/Documentacion/PDFs/Tarea6.docx
@@ -253,7 +253,7 @@
           <w:sz w:val="36"/>
           <w:szCs w:val="36"/>
         </w:rPr>
-        <w:t>6</w:t>
+        <w:t>7</w:t>
       </w:r>
     </w:p>
     <w:p>
@@ -415,7 +415,7 @@
           <w:sz w:val="36"/>
           <w:szCs w:val="36"/>
         </w:rPr>
-        <w:t>12</w:t>
+        <w:t>20</w:t>
       </w:r>
       <w:r>
         <w:rPr>
@@ -826,7 +826,7 @@
           <w:sz w:val="28"/>
           <w:szCs w:val="28"/>
         </w:rPr>
-        <w:t xml:space="preserve">Se busca crear scripts de automatización para servidores HTTP en Bash para Linux (openSUSE Leap 16.0) y PowerShell para Windows Server 2025. El sistema debe permitir instalar y configurar Apache2, </w:t>
+        <w:t xml:space="preserve">Se busca crear un script orquestador que conecte el servidor a un servidor ftp ya sea local o remoto para que de esta manera descargar los servicios http de apache, </w:t>
       </w:r>
       <w:proofErr w:type="spellStart"/>
       <w:r>
@@ -835,7 +835,7 @@
           <w:sz w:val="28"/>
           <w:szCs w:val="28"/>
         </w:rPr>
-        <w:t>Nginx</w:t>
+        <w:t>nginx</w:t>
       </w:r>
       <w:proofErr w:type="spellEnd"/>
       <w:r>
@@ -844,7 +844,7 @@
           <w:sz w:val="28"/>
           <w:szCs w:val="28"/>
         </w:rPr>
-        <w:t xml:space="preserve"> y Tomcat de manera automatizada, con selección de versiones específicas, configuración de puertos personalizados, implementación de medidas de seguridad (SELinux, firewall, </w:t>
+        <w:t xml:space="preserve"> o </w:t>
       </w:r>
       <w:proofErr w:type="spellStart"/>
       <w:r>
@@ -853,7 +853,7 @@
           <w:sz w:val="28"/>
           <w:szCs w:val="28"/>
         </w:rPr>
-        <w:t>headers</w:t>
+        <w:t>tomcat</w:t>
       </w:r>
       <w:proofErr w:type="spellEnd"/>
       <w:r>
@@ -862,34 +862,24 @@
           <w:sz w:val="28"/>
           <w:szCs w:val="28"/>
         </w:rPr>
-        <w:t xml:space="preserve"> HTTP), y funcionalidades de verificación y pruebas con </w:t>
-      </w:r>
-      <w:proofErr w:type="spellStart"/>
+        <w:t>, luego de hacer esto el script preguntara si desea activar la certificación SSL si el usuario dice que si, el script lo hará automáticamente y se podrá acceder desde https como ruta no segura</w:t>
+      </w:r>
       <w:r>
         <w:rPr>
           <w:rFonts w:ascii="Arial" w:hAnsi="Arial" w:cs="Arial"/>
           <w:sz w:val="28"/>
           <w:szCs w:val="28"/>
         </w:rPr>
-        <w:t>curl</w:t>
-      </w:r>
-      <w:proofErr w:type="spellEnd"/>
-      <w:r>
+        <w:t>.</w:t>
+      </w:r>
+    </w:p>
+    <w:p>
+      <w:pPr>
         <w:rPr>
           <w:rFonts w:ascii="Arial" w:hAnsi="Arial" w:cs="Arial"/>
           <w:sz w:val="28"/>
           <w:szCs w:val="28"/>
         </w:rPr>
-        <w:t>.</w:t>
-      </w:r>
-    </w:p>
-    <w:p>
-      <w:pPr>
-        <w:rPr>
-          <w:rFonts w:ascii="Arial" w:hAnsi="Arial" w:cs="Arial"/>
-          <w:sz w:val="28"/>
-          <w:szCs w:val="28"/>
-        </w:rPr>
       </w:pPr>
     </w:p>
     <w:p>
@@ -917,110 +907,96 @@
       <w:pPr>
         <w:rPr>
           <w:rFonts w:ascii="Arial" w:hAnsi="Arial" w:cs="Arial"/>
-        </w:rPr>
-      </w:pPr>
-      <w:r>
-        <w:rPr>
-          <w:rFonts w:ascii="Arial" w:hAnsi="Arial" w:cs="Arial"/>
-          <w:b/>
-          <w:bCs/>
-        </w:rPr>
-        <w:t>Requisitos Previos</w:t>
-      </w:r>
-      <w:r>
-        <w:rPr>
-          <w:rFonts w:ascii="Arial" w:hAnsi="Arial" w:cs="Arial"/>
-          <w:b/>
-          <w:bCs/>
-        </w:rPr>
-        <w:t xml:space="preserve">: </w:t>
-      </w:r>
-      <w:r>
-        <w:rPr>
-          <w:rFonts w:ascii="Arial" w:hAnsi="Arial" w:cs="Arial"/>
-        </w:rPr>
-        <w:t>Se deberá ejecutar el script como administrador.</w:t>
-      </w:r>
-    </w:p>
-    <w:p>
-      <w:pPr>
-        <w:rPr>
-          <w:rFonts w:ascii="Arial" w:hAnsi="Arial" w:cs="Arial"/>
-        </w:rPr>
-      </w:pPr>
-      <w:r>
-        <w:rPr>
-          <w:rFonts w:ascii="Arial" w:hAnsi="Arial" w:cs="Arial"/>
-          <w:b/>
-          <w:bCs/>
-        </w:rPr>
-        <w:t>Instrucciones de ejecución:</w:t>
-      </w:r>
-      <w:r>
-        <w:rPr>
-          <w:rFonts w:ascii="Arial" w:hAnsi="Arial" w:cs="Arial"/>
-          <w:b/>
-          <w:bCs/>
-        </w:rPr>
-        <w:t xml:space="preserve"> </w:t>
-      </w:r>
-    </w:p>
-    <w:p>
-      <w:pPr>
-        <w:rPr>
-          <w:rFonts w:ascii="Arial" w:hAnsi="Arial" w:cs="Arial"/>
-        </w:rPr>
-      </w:pPr>
-      <w:r>
-        <w:rPr>
-          <w:rFonts w:ascii="Arial" w:hAnsi="Arial" w:cs="Arial"/>
-        </w:rPr>
-        <w:t xml:space="preserve">Comando exacto en Linux: </w:t>
-      </w:r>
-      <w:proofErr w:type="gramStart"/>
-      <w:r>
-        <w:rPr>
-          <w:rFonts w:ascii="Arial" w:hAnsi="Arial" w:cs="Arial"/>
-        </w:rPr>
-        <w:t xml:space="preserve">sudo sh </w:t>
-      </w:r>
-      <w:r>
-        <w:rPr>
-          <w:rFonts w:ascii="Arial" w:hAnsi="Arial" w:cs="Arial"/>
-        </w:rPr>
-        <w:t>serviciosHTTP.sh</w:t>
-      </w:r>
-      <w:r>
-        <w:rPr>
-          <w:rFonts w:ascii="Arial" w:hAnsi="Arial" w:cs="Arial"/>
-        </w:rPr>
-        <w:t xml:space="preserve"> -?</w:t>
-      </w:r>
-      <w:proofErr w:type="gramEnd"/>
-    </w:p>
-    <w:p>
-      <w:pPr>
-        <w:rPr>
-          <w:rFonts w:ascii="Arial" w:hAnsi="Arial" w:cs="Arial"/>
-        </w:rPr>
-      </w:pPr>
-      <w:r>
-        <w:rPr>
-          <w:rFonts w:ascii="Arial" w:hAnsi="Arial" w:cs="Arial"/>
-        </w:rPr>
-        <w:t>Comando exacto en Windows: .\</w:t>
-      </w:r>
-      <w:r>
-        <w:rPr>
-          <w:rFonts w:ascii="Arial" w:hAnsi="Arial" w:cs="Arial"/>
-        </w:rPr>
-        <w:t>windows-serviciosHTTP</w:t>
-      </w:r>
-      <w:r>
-        <w:rPr>
-          <w:rFonts w:ascii="Arial" w:hAnsi="Arial" w:cs="Arial"/>
-        </w:rPr>
-        <w:t>.ps1</w:t>
+          <w:b/>
+          <w:bCs/>
+        </w:rPr>
+      </w:pPr>
+      <w:r>
+        <w:rPr>
+          <w:rFonts w:ascii="Arial" w:hAnsi="Arial" w:cs="Arial"/>
+          <w:b/>
+          <w:bCs/>
+        </w:rPr>
+        <w:t>REQUISITOS PREVIOS</w:t>
+      </w:r>
+    </w:p>
+    <w:p>
+      <w:pPr>
+        <w:numPr>
+          <w:ilvl w:val="0"/>
+          <w:numId w:val="16"/>
+        </w:numPr>
+        <w:rPr>
+          <w:rFonts w:ascii="Arial" w:hAnsi="Arial" w:cs="Arial"/>
+        </w:rPr>
+      </w:pPr>
+      <w:r>
+        <w:rPr>
+          <w:rFonts w:ascii="Arial" w:hAnsi="Arial" w:cs="Arial"/>
+        </w:rPr>
+        <w:t>Ejecutar PowerShell como Administrador (Windows)</w:t>
+      </w:r>
+    </w:p>
+    <w:p>
+      <w:pPr>
+        <w:numPr>
+          <w:ilvl w:val="0"/>
+          <w:numId w:val="16"/>
+        </w:numPr>
+        <w:rPr>
+          <w:rFonts w:ascii="Arial" w:hAnsi="Arial" w:cs="Arial"/>
+        </w:rPr>
+      </w:pPr>
+      <w:r>
+        <w:rPr>
+          <w:rFonts w:ascii="Arial" w:hAnsi="Arial" w:cs="Arial"/>
+        </w:rPr>
+        <w:t xml:space="preserve">Ejecutar con sudo o como </w:t>
+      </w:r>
+      <w:proofErr w:type="spellStart"/>
+      <w:r>
+        <w:rPr>
+          <w:rFonts w:ascii="Arial" w:hAnsi="Arial" w:cs="Arial"/>
+        </w:rPr>
+        <w:t>root</w:t>
+      </w:r>
+      <w:proofErr w:type="spellEnd"/>
+      <w:r>
+        <w:rPr>
+          <w:rFonts w:ascii="Arial" w:hAnsi="Arial" w:cs="Arial"/>
+        </w:rPr>
+        <w:t xml:space="preserve"> (Linux)</w:t>
+      </w:r>
+    </w:p>
+    <w:p>
+      <w:pPr>
+        <w:numPr>
+          <w:ilvl w:val="0"/>
+          <w:numId w:val="16"/>
+        </w:numPr>
+        <w:rPr>
+          <w:rFonts w:ascii="Arial" w:hAnsi="Arial" w:cs="Arial"/>
+        </w:rPr>
+      </w:pPr>
+      <w:r>
+        <w:rPr>
+          <w:rFonts w:ascii="Arial" w:hAnsi="Arial" w:cs="Arial"/>
+        </w:rPr>
+        <w:t xml:space="preserve">Ambas </w:t>
+      </w:r>
+      <w:proofErr w:type="spellStart"/>
+      <w:r>
+        <w:rPr>
+          <w:rFonts w:ascii="Arial" w:hAnsi="Arial" w:cs="Arial"/>
+        </w:rPr>
+        <w:t>VMs</w:t>
+      </w:r>
+      <w:proofErr w:type="spellEnd"/>
+      <w:r>
+        <w:rPr>
+          <w:rFonts w:ascii="Arial" w:hAnsi="Arial" w:cs="Arial"/>
+        </w:rPr>
+        <w:t xml:space="preserve"> deben tener acceso al servidor FTP (192.168.1.68)</w:t>
       </w:r>
     </w:p>
     <w:p>
@@ -1181,7 +1157,6 @@
         <w:rPr>
           <w:rFonts w:ascii="Arial" w:hAnsi="Arial" w:cs="Arial"/>
         </w:rPr>
-        <w:lastRenderedPageBreak/>
         <w:t xml:space="preserve">El usuario deberá seleccionar la versión deseada del menú presentado (se indica cuál es LTS/Estable y cuál es </w:t>
       </w:r>
       <w:proofErr w:type="spellStart"/>
@@ -1214,6 +1189,7 @@
         <w:rPr>
           <w:rFonts w:ascii="Arial" w:hAnsi="Arial" w:cs="Arial"/>
         </w:rPr>
+        <w:lastRenderedPageBreak/>
         <w:t>El script solicitará el puerto en el que desea ejecutar el servidor (por defecto 80, validando que no sea un puerto reservado: 22, 21, 23, 25, 53, 443, 3306, 5432, 6379, 27017).</w:t>
       </w:r>
     </w:p>
@@ -1434,10 +1410,24 @@
     </w:p>
     <w:p>
       <w:pPr>
-        <w:pStyle w:val="Prrafodelista"/>
+        <w:rPr>
+          <w:rFonts w:ascii="Arial" w:hAnsi="Arial" w:cs="Arial"/>
+        </w:rPr>
+      </w:pPr>
+      <w:r>
+        <w:rPr>
+          <w:rFonts w:ascii="Arial" w:hAnsi="Arial" w:cs="Arial"/>
+          <w:b/>
+          <w:bCs/>
+        </w:rPr>
+        <w:t>WINDOWS - practica7_windows.ps1</w:t>
+      </w:r>
+    </w:p>
+    <w:p>
+      <w:pPr>
         <w:numPr>
           <w:ilvl w:val="0"/>
-          <w:numId w:val="11"/>
+          <w:numId w:val="17"/>
         </w:numPr>
         <w:rPr>
           <w:rFonts w:ascii="Arial" w:hAnsi="Arial" w:cs="Arial"/>
@@ -1447,15 +1437,272 @@
         <w:rPr>
           <w:rFonts w:ascii="Arial" w:hAnsi="Arial" w:cs="Arial"/>
         </w:rPr>
-        <w:t>Si selecciona la opción de instalar (-i), el script primero consultará las versiones disponibles del servidor elegido:</w:t>
-      </w:r>
-    </w:p>
-    <w:p>
-      <w:pPr>
-        <w:pStyle w:val="Prrafodelista"/>
+        <w:t>Abrir PowerShell como Administrador</w:t>
+      </w:r>
+    </w:p>
+    <w:p>
+      <w:pPr>
+        <w:numPr>
+          <w:ilvl w:val="0"/>
+          <w:numId w:val="17"/>
+        </w:numPr>
+        <w:rPr>
+          <w:rFonts w:ascii="Arial" w:hAnsi="Arial" w:cs="Arial"/>
+        </w:rPr>
+      </w:pPr>
+      <w:r>
+        <w:rPr>
+          <w:rFonts w:ascii="Arial" w:hAnsi="Arial" w:cs="Arial"/>
+        </w:rPr>
+        <w:t>Navegar a la carpeta del script: cd ruta\del\script</w:t>
+      </w:r>
+    </w:p>
+    <w:p>
+      <w:pPr>
+        <w:numPr>
+          <w:ilvl w:val="0"/>
+          <w:numId w:val="17"/>
+        </w:numPr>
+        <w:rPr>
+          <w:rFonts w:ascii="Arial" w:hAnsi="Arial" w:cs="Arial"/>
+        </w:rPr>
+      </w:pPr>
+      <w:r>
+        <w:rPr>
+          <w:rFonts w:ascii="Arial" w:hAnsi="Arial" w:cs="Arial"/>
+        </w:rPr>
+        <w:t>Ejecutar: .\practica7_windows.ps1</w:t>
+      </w:r>
+    </w:p>
+    <w:p>
+      <w:pPr>
+        <w:numPr>
+          <w:ilvl w:val="0"/>
+          <w:numId w:val="17"/>
+        </w:numPr>
+        <w:rPr>
+          <w:rFonts w:ascii="Arial" w:hAnsi="Arial" w:cs="Arial"/>
+        </w:rPr>
+      </w:pPr>
+      <w:r>
+        <w:rPr>
+          <w:rFonts w:ascii="Arial" w:hAnsi="Arial" w:cs="Arial"/>
+        </w:rPr>
+        <w:t xml:space="preserve">El script instala </w:t>
+      </w:r>
+      <w:proofErr w:type="spellStart"/>
+      <w:r>
+        <w:rPr>
+          <w:rFonts w:ascii="Arial" w:hAnsi="Arial" w:cs="Arial"/>
+        </w:rPr>
+        <w:t>Chocolatey</w:t>
+      </w:r>
+      <w:proofErr w:type="spellEnd"/>
+      <w:r>
+        <w:rPr>
+          <w:rFonts w:ascii="Arial" w:hAnsi="Arial" w:cs="Arial"/>
+        </w:rPr>
+        <w:t xml:space="preserve"> automáticamente si no está presente</w:t>
+      </w:r>
+    </w:p>
+    <w:p>
+      <w:pPr>
+        <w:numPr>
+          <w:ilvl w:val="0"/>
+          <w:numId w:val="17"/>
+        </w:numPr>
+        <w:rPr>
+          <w:rFonts w:ascii="Arial" w:hAnsi="Arial" w:cs="Arial"/>
+        </w:rPr>
+      </w:pPr>
+      <w:r>
+        <w:rPr>
+          <w:rFonts w:ascii="Arial" w:hAnsi="Arial" w:cs="Arial"/>
+        </w:rPr>
+        <w:t xml:space="preserve">Seleccionar el servicio a instalar: IIS (1), Apache (2) o </w:t>
+      </w:r>
+      <w:proofErr w:type="spellStart"/>
+      <w:r>
+        <w:rPr>
+          <w:rFonts w:ascii="Arial" w:hAnsi="Arial" w:cs="Arial"/>
+        </w:rPr>
+        <w:t>Nginx</w:t>
+      </w:r>
+      <w:proofErr w:type="spellEnd"/>
+      <w:r>
+        <w:rPr>
+          <w:rFonts w:ascii="Arial" w:hAnsi="Arial" w:cs="Arial"/>
+        </w:rPr>
+        <w:t xml:space="preserve"> (3)</w:t>
+      </w:r>
+    </w:p>
+    <w:p>
+      <w:pPr>
+        <w:numPr>
+          <w:ilvl w:val="0"/>
+          <w:numId w:val="17"/>
+        </w:numPr>
+        <w:rPr>
+          <w:rFonts w:ascii="Arial" w:hAnsi="Arial" w:cs="Arial"/>
+        </w:rPr>
+      </w:pPr>
+      <w:r>
+        <w:rPr>
+          <w:rFonts w:ascii="Arial" w:hAnsi="Arial" w:cs="Arial"/>
+        </w:rPr>
+        <w:t>Para IIS: la fuente se omite, se instala directo desde Windows</w:t>
+      </w:r>
+    </w:p>
+    <w:p>
+      <w:pPr>
+        <w:numPr>
+          <w:ilvl w:val="0"/>
+          <w:numId w:val="17"/>
+        </w:numPr>
+        <w:rPr>
+          <w:rFonts w:ascii="Arial" w:hAnsi="Arial" w:cs="Arial"/>
+        </w:rPr>
+      </w:pPr>
+      <w:r>
+        <w:rPr>
+          <w:rFonts w:ascii="Arial" w:hAnsi="Arial" w:cs="Arial"/>
+        </w:rPr>
+        <w:t>Para Apache/</w:t>
+      </w:r>
+      <w:proofErr w:type="spellStart"/>
+      <w:r>
+        <w:rPr>
+          <w:rFonts w:ascii="Arial" w:hAnsi="Arial" w:cs="Arial"/>
+        </w:rPr>
+        <w:t>Nginx</w:t>
+      </w:r>
+      <w:proofErr w:type="spellEnd"/>
+      <w:r>
+        <w:rPr>
+          <w:rFonts w:ascii="Arial" w:hAnsi="Arial" w:cs="Arial"/>
+        </w:rPr>
+        <w:t>: elegir fuente WEB (</w:t>
+      </w:r>
+      <w:proofErr w:type="spellStart"/>
+      <w:r>
+        <w:rPr>
+          <w:rFonts w:ascii="Arial" w:hAnsi="Arial" w:cs="Arial"/>
+        </w:rPr>
+        <w:t>Chocolatey</w:t>
+      </w:r>
+      <w:proofErr w:type="spellEnd"/>
+      <w:r>
+        <w:rPr>
+          <w:rFonts w:ascii="Arial" w:hAnsi="Arial" w:cs="Arial"/>
+        </w:rPr>
+        <w:t>) o FTP (repositorio privado)</w:t>
+      </w:r>
+    </w:p>
+    <w:p>
+      <w:pPr>
+        <w:numPr>
+          <w:ilvl w:val="0"/>
+          <w:numId w:val="17"/>
+        </w:numPr>
+        <w:rPr>
+          <w:rFonts w:ascii="Arial" w:hAnsi="Arial" w:cs="Arial"/>
+        </w:rPr>
+      </w:pPr>
+      <w:r>
+        <w:rPr>
+          <w:rFonts w:ascii="Arial" w:hAnsi="Arial" w:cs="Arial"/>
+        </w:rPr>
+        <w:t>Responder si se desea activar SSL/TLS (S/N)</w:t>
+      </w:r>
+    </w:p>
+    <w:p>
+      <w:pPr>
+        <w:numPr>
+          <w:ilvl w:val="0"/>
+          <w:numId w:val="17"/>
+        </w:numPr>
+        <w:rPr>
+          <w:rFonts w:ascii="Arial" w:hAnsi="Arial" w:cs="Arial"/>
+        </w:rPr>
+      </w:pPr>
+      <w:r>
+        <w:rPr>
+          <w:rFonts w:ascii="Arial" w:hAnsi="Arial" w:cs="Arial"/>
+        </w:rPr>
+        <w:t>Ingresar el puerto HTTP deseado (ej. 800). Si se activó SSL, HTTPS usará puerto+1 (ej. 801)</w:t>
+      </w:r>
+    </w:p>
+    <w:p>
+      <w:pPr>
+        <w:numPr>
+          <w:ilvl w:val="0"/>
+          <w:numId w:val="17"/>
+        </w:numPr>
+        <w:rPr>
+          <w:rFonts w:ascii="Arial" w:hAnsi="Arial" w:cs="Arial"/>
+        </w:rPr>
+      </w:pPr>
+      <w:r>
+        <w:rPr>
+          <w:rFonts w:ascii="Arial" w:hAnsi="Arial" w:cs="Arial"/>
+        </w:rPr>
+        <w:t>El script descarga, extrae, configura el servidor, abre el firewall y lo registra como servicio</w:t>
+      </w:r>
+    </w:p>
+    <w:p>
+      <w:pPr>
+        <w:numPr>
+          <w:ilvl w:val="0"/>
+          <w:numId w:val="17"/>
+        </w:numPr>
+        <w:rPr>
+          <w:rFonts w:ascii="Arial" w:hAnsi="Arial" w:cs="Arial"/>
+        </w:rPr>
+      </w:pPr>
+      <w:r>
+        <w:rPr>
+          <w:rFonts w:ascii="Arial" w:hAnsi="Arial" w:cs="Arial"/>
+        </w:rPr>
+        <w:t xml:space="preserve">Si se activó SSL: genera certificado </w:t>
+      </w:r>
+      <w:proofErr w:type="spellStart"/>
+      <w:r>
+        <w:rPr>
+          <w:rFonts w:ascii="Arial" w:hAnsi="Arial" w:cs="Arial"/>
+        </w:rPr>
+        <w:t>autofirmado</w:t>
+      </w:r>
+      <w:proofErr w:type="spellEnd"/>
+      <w:r>
+        <w:rPr>
+          <w:rFonts w:ascii="Arial" w:hAnsi="Arial" w:cs="Arial"/>
+        </w:rPr>
+        <w:t xml:space="preserve"> con OpenSSL, configura HTTPS y reinicia el servicio</w:t>
+      </w:r>
+    </w:p>
+    <w:p>
+      <w:pPr>
+        <w:numPr>
+          <w:ilvl w:val="0"/>
+          <w:numId w:val="17"/>
+        </w:numPr>
+        <w:rPr>
+          <w:rFonts w:ascii="Arial" w:hAnsi="Arial" w:cs="Arial"/>
+        </w:rPr>
+      </w:pPr>
+      <w:r>
+        <w:rPr>
+          <w:rFonts w:ascii="Arial" w:hAnsi="Arial" w:cs="Arial"/>
+        </w:rPr>
+        <w:lastRenderedPageBreak/>
+        <w:t xml:space="preserve">Al finalizar, verificar acceso en el navegador: </w:t>
+      </w:r>
+    </w:p>
+    <w:p>
+      <w:pPr>
         <w:numPr>
           <w:ilvl w:val="1"/>
-          <w:numId w:val="11"/>
+          <w:numId w:val="17"/>
         </w:numPr>
         <w:rPr>
           <w:rFonts w:ascii="Arial" w:hAnsi="Arial" w:cs="Arial"/>
@@ -1465,71 +1712,26 @@
         <w:rPr>
           <w:rFonts w:ascii="Arial" w:hAnsi="Arial" w:cs="Arial"/>
         </w:rPr>
-        <w:t>Para Apache2/</w:t>
-      </w:r>
-      <w:proofErr w:type="spellStart"/>
-      <w:r>
-        <w:rPr>
-          <w:rFonts w:ascii="Arial" w:hAnsi="Arial" w:cs="Arial"/>
-        </w:rPr>
-        <w:t>Nginx</w:t>
-      </w:r>
-      <w:proofErr w:type="spellEnd"/>
-      <w:r>
-        <w:rPr>
-          <w:rFonts w:ascii="Arial" w:hAnsi="Arial" w:cs="Arial"/>
-        </w:rPr>
-        <w:t>: usa '</w:t>
-      </w:r>
-      <w:proofErr w:type="spellStart"/>
-      <w:r>
-        <w:rPr>
-          <w:rFonts w:ascii="Arial" w:hAnsi="Arial" w:cs="Arial"/>
-        </w:rPr>
-        <w:t>zypper</w:t>
-      </w:r>
-      <w:proofErr w:type="spellEnd"/>
-      <w:r>
-        <w:rPr>
-          <w:rFonts w:ascii="Arial" w:hAnsi="Arial" w:cs="Arial"/>
-        </w:rPr>
-        <w:t xml:space="preserve"> se --match-</w:t>
-      </w:r>
-      <w:proofErr w:type="spellStart"/>
-      <w:r>
-        <w:rPr>
-          <w:rFonts w:ascii="Arial" w:hAnsi="Arial" w:cs="Arial"/>
-        </w:rPr>
-        <w:t>exact</w:t>
-      </w:r>
-      <w:proofErr w:type="spellEnd"/>
-      <w:r>
-        <w:rPr>
-          <w:rFonts w:ascii="Arial" w:hAnsi="Arial" w:cs="Arial"/>
-        </w:rPr>
-        <w:t xml:space="preserve"> --</w:t>
-      </w:r>
-      <w:proofErr w:type="spellStart"/>
-      <w:r>
-        <w:rPr>
-          <w:rFonts w:ascii="Arial" w:hAnsi="Arial" w:cs="Arial"/>
-        </w:rPr>
-        <w:t>details</w:t>
-      </w:r>
-      <w:proofErr w:type="spellEnd"/>
-      <w:r>
-        <w:rPr>
-          <w:rFonts w:ascii="Arial" w:hAnsi="Arial" w:cs="Arial"/>
-        </w:rPr>
-        <w:t>' para obtener versiones del repositorio</w:t>
-      </w:r>
-    </w:p>
-    <w:p>
-      <w:pPr>
-        <w:pStyle w:val="Prrafodelista"/>
+        <w:t>HTTP: http://</w:t>
+      </w:r>
+      <w:r>
+        <w:rPr>
+          <w:rFonts w:ascii="Arial" w:hAnsi="Arial" w:cs="Arial"/>
+        </w:rPr>
+        <w:t>IP</w:t>
+      </w:r>
+      <w:r>
+        <w:rPr>
+          <w:rFonts w:ascii="Arial" w:hAnsi="Arial" w:cs="Arial"/>
+        </w:rPr>
+        <w:t>:PUERTO</w:t>
+      </w:r>
+    </w:p>
+    <w:p>
+      <w:pPr>
         <w:numPr>
           <w:ilvl w:val="1"/>
-          <w:numId w:val="11"/>
+          <w:numId w:val="17"/>
         </w:numPr>
         <w:rPr>
           <w:rFonts w:ascii="Arial" w:hAnsi="Arial" w:cs="Arial"/>
@@ -1539,15 +1741,55 @@
         <w:rPr>
           <w:rFonts w:ascii="Arial" w:hAnsi="Arial" w:cs="Arial"/>
         </w:rPr>
-        <w:t>Para Tomcat: consulta https://dlcdn.apache.org/tomcat/ para obtener las últimas versiones de cada rama (9.x, 10.x, 11.x)</w:t>
-      </w:r>
-    </w:p>
-    <w:p>
-      <w:pPr>
-        <w:pStyle w:val="Prrafodelista"/>
+        <w:t>HTTPS: https://</w:t>
+      </w:r>
+      <w:r>
+        <w:rPr>
+          <w:rFonts w:ascii="Arial" w:hAnsi="Arial" w:cs="Arial"/>
+        </w:rPr>
+        <w:t>IP</w:t>
+      </w:r>
+      <w:r>
+        <w:rPr>
+          <w:rFonts w:ascii="Arial" w:hAnsi="Arial" w:cs="Arial"/>
+        </w:rPr>
+        <w:t xml:space="preserve">:PUERTO+1 (aceptar advertencia de certificado </w:t>
+      </w:r>
+      <w:proofErr w:type="spellStart"/>
+      <w:r>
+        <w:rPr>
+          <w:rFonts w:ascii="Arial" w:hAnsi="Arial" w:cs="Arial"/>
+        </w:rPr>
+        <w:t>autofirmado</w:t>
+      </w:r>
+      <w:proofErr w:type="spellEnd"/>
+      <w:r>
+        <w:rPr>
+          <w:rFonts w:ascii="Arial" w:hAnsi="Arial" w:cs="Arial"/>
+        </w:rPr>
+        <w:t>)</w:t>
+      </w:r>
+    </w:p>
+    <w:p>
+      <w:pPr>
+        <w:rPr>
+          <w:rFonts w:ascii="Arial" w:hAnsi="Arial" w:cs="Arial"/>
+        </w:rPr>
+      </w:pPr>
+      <w:r>
+        <w:rPr>
+          <w:rFonts w:ascii="Arial" w:hAnsi="Arial" w:cs="Arial"/>
+          <w:b/>
+          <w:bCs/>
+        </w:rPr>
+        <w:t>LINUX - practica7_linux.sh</w:t>
+      </w:r>
+    </w:p>
+    <w:p>
+      <w:pPr>
         <w:numPr>
           <w:ilvl w:val="0"/>
-          <w:numId w:val="11"/>
+          <w:numId w:val="18"/>
         </w:numPr>
         <w:rPr>
           <w:rFonts w:ascii="Arial" w:hAnsi="Arial" w:cs="Arial"/>
@@ -1557,43 +1799,276 @@
         <w:rPr>
           <w:rFonts w:ascii="Arial" w:hAnsi="Arial" w:cs="Arial"/>
         </w:rPr>
-        <w:t xml:space="preserve">El script valida el puerto ingresado con la función </w:t>
+        <w:t>Abrir terminal</w:t>
+      </w:r>
+    </w:p>
+    <w:p>
+      <w:pPr>
+        <w:numPr>
+          <w:ilvl w:val="0"/>
+          <w:numId w:val="18"/>
+        </w:numPr>
+        <w:rPr>
+          <w:rFonts w:ascii="Arial" w:hAnsi="Arial" w:cs="Arial"/>
+        </w:rPr>
+      </w:pPr>
+      <w:r>
+        <w:rPr>
+          <w:rFonts w:ascii="Arial" w:hAnsi="Arial" w:cs="Arial"/>
+        </w:rPr>
+        <w:t xml:space="preserve">Dar permisos de ejecución: </w:t>
       </w:r>
       <w:proofErr w:type="spellStart"/>
       <w:r>
         <w:rPr>
           <w:rFonts w:ascii="Arial" w:hAnsi="Arial" w:cs="Arial"/>
         </w:rPr>
-        <w:t>validar_</w:t>
-      </w:r>
-      <w:proofErr w:type="gramStart"/>
-      <w:r>
-        <w:rPr>
-          <w:rFonts w:ascii="Arial" w:hAnsi="Arial" w:cs="Arial"/>
-        </w:rPr>
-        <w:t>puerto</w:t>
+        <w:t>chmod</w:t>
       </w:r>
       <w:proofErr w:type="spellEnd"/>
       <w:r>
         <w:rPr>
           <w:rFonts w:ascii="Arial" w:hAnsi="Arial" w:cs="Arial"/>
         </w:rPr>
-        <w:t>(</w:t>
-      </w:r>
-      <w:proofErr w:type="gramEnd"/>
-      <w:r>
-        <w:rPr>
-          <w:rFonts w:ascii="Arial" w:hAnsi="Arial" w:cs="Arial"/>
-        </w:rPr>
-        <w:t>) que verifica:</w:t>
-      </w:r>
-    </w:p>
-    <w:p>
-      <w:pPr>
-        <w:pStyle w:val="Prrafodelista"/>
+        <w:t xml:space="preserve"> +x practica7_linux.sh</w:t>
+      </w:r>
+    </w:p>
+    <w:p>
+      <w:pPr>
+        <w:numPr>
+          <w:ilvl w:val="0"/>
+          <w:numId w:val="18"/>
+        </w:numPr>
+        <w:rPr>
+          <w:rFonts w:ascii="Arial" w:hAnsi="Arial" w:cs="Arial"/>
+        </w:rPr>
+      </w:pPr>
+      <w:r>
+        <w:rPr>
+          <w:rFonts w:ascii="Arial" w:hAnsi="Arial" w:cs="Arial"/>
+        </w:rPr>
+        <w:t>Ejecutar con sudo: sudo ./practica7_linux.sh</w:t>
+      </w:r>
+    </w:p>
+    <w:p>
+      <w:pPr>
+        <w:numPr>
+          <w:ilvl w:val="0"/>
+          <w:numId w:val="18"/>
+        </w:numPr>
+        <w:rPr>
+          <w:rFonts w:ascii="Arial" w:hAnsi="Arial" w:cs="Arial"/>
+        </w:rPr>
+      </w:pPr>
+      <w:r>
+        <w:rPr>
+          <w:rFonts w:ascii="Arial" w:hAnsi="Arial" w:cs="Arial"/>
+        </w:rPr>
+        <w:t xml:space="preserve">Seleccionar el servicio: Apache (1), </w:t>
+      </w:r>
+      <w:proofErr w:type="spellStart"/>
+      <w:r>
+        <w:rPr>
+          <w:rFonts w:ascii="Arial" w:hAnsi="Arial" w:cs="Arial"/>
+        </w:rPr>
+        <w:t>Nginx</w:t>
+      </w:r>
+      <w:proofErr w:type="spellEnd"/>
+      <w:r>
+        <w:rPr>
+          <w:rFonts w:ascii="Arial" w:hAnsi="Arial" w:cs="Arial"/>
+        </w:rPr>
+        <w:t xml:space="preserve"> (2) o Tomcat (3)</w:t>
+      </w:r>
+    </w:p>
+    <w:p>
+      <w:pPr>
+        <w:numPr>
+          <w:ilvl w:val="0"/>
+          <w:numId w:val="18"/>
+        </w:numPr>
+        <w:rPr>
+          <w:rFonts w:ascii="Arial" w:hAnsi="Arial" w:cs="Arial"/>
+        </w:rPr>
+      </w:pPr>
+      <w:r>
+        <w:rPr>
+          <w:rFonts w:ascii="Arial" w:hAnsi="Arial" w:cs="Arial"/>
+        </w:rPr>
+        <w:t>Elegir fuente de instalación: WEB (repositorios del sistema) o FTP (repositorio privado)</w:t>
+      </w:r>
+    </w:p>
+    <w:p>
+      <w:pPr>
+        <w:numPr>
+          <w:ilvl w:val="0"/>
+          <w:numId w:val="18"/>
+        </w:numPr>
+        <w:rPr>
+          <w:rFonts w:ascii="Arial" w:hAnsi="Arial" w:cs="Arial"/>
+        </w:rPr>
+      </w:pPr>
+      <w:r>
+        <w:rPr>
+          <w:rFonts w:ascii="Arial" w:hAnsi="Arial" w:cs="Arial"/>
+        </w:rPr>
+        <w:t>Para FTP: el script se conecta a 192.168.1.68, lista los archivos disponibles y descarga el seleccionado, verificando el hash SHA256</w:t>
+      </w:r>
+    </w:p>
+    <w:p>
+      <w:pPr>
+        <w:numPr>
+          <w:ilvl w:val="0"/>
+          <w:numId w:val="18"/>
+        </w:numPr>
+        <w:rPr>
+          <w:rFonts w:ascii="Arial" w:hAnsi="Arial" w:cs="Arial"/>
+        </w:rPr>
+      </w:pPr>
+      <w:r>
+        <w:rPr>
+          <w:rFonts w:ascii="Arial" w:hAnsi="Arial" w:cs="Arial"/>
+        </w:rPr>
+        <w:t>Responder si se desea activar SSL/TLS (S/N)</w:t>
+      </w:r>
+    </w:p>
+    <w:p>
+      <w:pPr>
+        <w:numPr>
+          <w:ilvl w:val="0"/>
+          <w:numId w:val="18"/>
+        </w:numPr>
+        <w:rPr>
+          <w:rFonts w:ascii="Arial" w:hAnsi="Arial" w:cs="Arial"/>
+        </w:rPr>
+      </w:pPr>
+      <w:r>
+        <w:rPr>
+          <w:rFonts w:ascii="Arial" w:hAnsi="Arial" w:cs="Arial"/>
+        </w:rPr>
+        <w:t>Ingresar el puerto HTTP deseado. Si se activó SSL, HTTPS usará puerto+1</w:t>
+      </w:r>
+    </w:p>
+    <w:p>
+      <w:pPr>
+        <w:numPr>
+          <w:ilvl w:val="0"/>
+          <w:numId w:val="18"/>
+        </w:numPr>
+        <w:rPr>
+          <w:rFonts w:ascii="Arial" w:hAnsi="Arial" w:cs="Arial"/>
+        </w:rPr>
+      </w:pPr>
+      <w:r>
+        <w:rPr>
+          <w:rFonts w:ascii="Arial" w:hAnsi="Arial" w:cs="Arial"/>
+        </w:rPr>
+        <w:t xml:space="preserve">El script instala, configura el servidor, abre el puerto en el firewall con </w:t>
+      </w:r>
+      <w:proofErr w:type="spellStart"/>
+      <w:r>
+        <w:rPr>
+          <w:rFonts w:ascii="Arial" w:hAnsi="Arial" w:cs="Arial"/>
+        </w:rPr>
+        <w:t>firewalld</w:t>
+      </w:r>
+      <w:proofErr w:type="spellEnd"/>
+      <w:r>
+        <w:rPr>
+          <w:rFonts w:ascii="Arial" w:hAnsi="Arial" w:cs="Arial"/>
+        </w:rPr>
+        <w:t>/</w:t>
+      </w:r>
+      <w:proofErr w:type="spellStart"/>
+      <w:r>
+        <w:rPr>
+          <w:rFonts w:ascii="Arial" w:hAnsi="Arial" w:cs="Arial"/>
+        </w:rPr>
+        <w:t>ufw</w:t>
+      </w:r>
+      <w:proofErr w:type="spellEnd"/>
+      <w:r>
+        <w:rPr>
+          <w:rFonts w:ascii="Arial" w:hAnsi="Arial" w:cs="Arial"/>
+        </w:rPr>
+        <w:t xml:space="preserve"> y lo habilita como servicio </w:t>
+      </w:r>
+      <w:proofErr w:type="spellStart"/>
+      <w:r>
+        <w:rPr>
+          <w:rFonts w:ascii="Arial" w:hAnsi="Arial" w:cs="Arial"/>
+        </w:rPr>
+        <w:t>systemd</w:t>
+      </w:r>
+      <w:proofErr w:type="spellEnd"/>
+    </w:p>
+    <w:p>
+      <w:pPr>
+        <w:numPr>
+          <w:ilvl w:val="0"/>
+          <w:numId w:val="18"/>
+        </w:numPr>
+        <w:rPr>
+          <w:rFonts w:ascii="Arial" w:hAnsi="Arial" w:cs="Arial"/>
+        </w:rPr>
+      </w:pPr>
+      <w:r>
+        <w:rPr>
+          <w:rFonts w:ascii="Arial" w:hAnsi="Arial" w:cs="Arial"/>
+        </w:rPr>
+        <w:t xml:space="preserve">Si se activó SSL: genera certificado </w:t>
+      </w:r>
+      <w:proofErr w:type="spellStart"/>
+      <w:r>
+        <w:rPr>
+          <w:rFonts w:ascii="Arial" w:hAnsi="Arial" w:cs="Arial"/>
+        </w:rPr>
+        <w:t>autofirmado</w:t>
+      </w:r>
+      <w:proofErr w:type="spellEnd"/>
+      <w:r>
+        <w:rPr>
+          <w:rFonts w:ascii="Arial" w:hAnsi="Arial" w:cs="Arial"/>
+        </w:rPr>
+        <w:t xml:space="preserve"> con OpenSSL, configura el </w:t>
+      </w:r>
+      <w:proofErr w:type="spellStart"/>
+      <w:r>
+        <w:rPr>
+          <w:rFonts w:ascii="Arial" w:hAnsi="Arial" w:cs="Arial"/>
+        </w:rPr>
+        <w:t>VirtualHost</w:t>
+      </w:r>
+      <w:proofErr w:type="spellEnd"/>
+      <w:r>
+        <w:rPr>
+          <w:rFonts w:ascii="Arial" w:hAnsi="Arial" w:cs="Arial"/>
+        </w:rPr>
+        <w:t xml:space="preserve"> HTTPS y reinicia el servicio</w:t>
+      </w:r>
+    </w:p>
+    <w:p>
+      <w:pPr>
+        <w:numPr>
+          <w:ilvl w:val="0"/>
+          <w:numId w:val="18"/>
+        </w:numPr>
+        <w:rPr>
+          <w:rFonts w:ascii="Arial" w:hAnsi="Arial" w:cs="Arial"/>
+        </w:rPr>
+      </w:pPr>
+      <w:r>
+        <w:rPr>
+          <w:rFonts w:ascii="Arial" w:hAnsi="Arial" w:cs="Arial"/>
+        </w:rPr>
+        <w:t xml:space="preserve">Al finalizar, verificar acceso: </w:t>
+      </w:r>
+    </w:p>
+    <w:p>
+      <w:pPr>
         <w:numPr>
           <w:ilvl w:val="1"/>
-          <w:numId w:val="11"/>
+          <w:numId w:val="18"/>
         </w:numPr>
         <w:rPr>
           <w:rFonts w:ascii="Arial" w:hAnsi="Arial" w:cs="Arial"/>
@@ -1603,15 +2078,14 @@
         <w:rPr>
           <w:rFonts w:ascii="Arial" w:hAnsi="Arial" w:cs="Arial"/>
         </w:rPr>
-        <w:t>Que sea un número válido entre 1-65535</w:t>
-      </w:r>
-    </w:p>
-    <w:p>
-      <w:pPr>
-        <w:pStyle w:val="Prrafodelista"/>
+        <w:t>HTTP: http://IP_VM:PUERTO</w:t>
+      </w:r>
+    </w:p>
+    <w:p>
+      <w:pPr>
         <w:numPr>
           <w:ilvl w:val="1"/>
-          <w:numId w:val="11"/>
+          <w:numId w:val="18"/>
         </w:numPr>
         <w:rPr>
           <w:rFonts w:ascii="Arial" w:hAnsi="Arial" w:cs="Arial"/>
@@ -1621,1619 +2095,36 @@
         <w:rPr>
           <w:rFonts w:ascii="Arial" w:hAnsi="Arial" w:cs="Arial"/>
         </w:rPr>
-        <w:t>Que no esté en la lista de puertos reservados</w:t>
-      </w:r>
-    </w:p>
-    <w:p>
-      <w:pPr>
-        <w:pStyle w:val="Prrafodelista"/>
-        <w:numPr>
-          <w:ilvl w:val="1"/>
-          <w:numId w:val="11"/>
-        </w:numPr>
-        <w:rPr>
-          <w:rFonts w:ascii="Arial" w:hAnsi="Arial" w:cs="Arial"/>
-        </w:rPr>
-      </w:pPr>
-      <w:r>
-        <w:rPr>
-          <w:rFonts w:ascii="Arial" w:hAnsi="Arial" w:cs="Arial"/>
-        </w:rPr>
-        <w:t xml:space="preserve">Que no esté ya en uso (mediante </w:t>
+        <w:t xml:space="preserve">HTTPS: https://IP_VM:PUERTO+1 (aceptar advertencia de certificado </w:t>
       </w:r>
       <w:proofErr w:type="spellStart"/>
       <w:r>
         <w:rPr>
           <w:rFonts w:ascii="Arial" w:hAnsi="Arial" w:cs="Arial"/>
         </w:rPr>
-        <w:t>ss</w:t>
+        <w:t>autofirmado</w:t>
       </w:r>
       <w:proofErr w:type="spellEnd"/>
       <w:r>
         <w:rPr>
           <w:rFonts w:ascii="Arial" w:hAnsi="Arial" w:cs="Arial"/>
         </w:rPr>
-        <w:t xml:space="preserve"> -</w:t>
-      </w:r>
-      <w:proofErr w:type="spellStart"/>
-      <w:r>
-        <w:rPr>
-          <w:rFonts w:ascii="Arial" w:hAnsi="Arial" w:cs="Arial"/>
-        </w:rPr>
-        <w:t>tulnp</w:t>
-      </w:r>
-      <w:proofErr w:type="spellEnd"/>
-      <w:r>
-        <w:rPr>
-          <w:rFonts w:ascii="Arial" w:hAnsi="Arial" w:cs="Arial"/>
-        </w:rPr>
         <w:t>)</w:t>
       </w:r>
     </w:p>
     <w:p>
       <w:pPr>
-        <w:pStyle w:val="Prrafodelista"/>
-        <w:numPr>
-          <w:ilvl w:val="0"/>
-          <w:numId w:val="11"/>
-        </w:numPr>
-        <w:rPr>
-          <w:rFonts w:ascii="Arial" w:hAnsi="Arial" w:cs="Arial"/>
-        </w:rPr>
-      </w:pPr>
-      <w:r>
-        <w:rPr>
-          <w:rFonts w:ascii="Arial" w:hAnsi="Arial" w:cs="Arial"/>
-        </w:rPr>
-        <w:t>Para Apache2, el script:</w:t>
-      </w:r>
-    </w:p>
-    <w:p>
-      <w:pPr>
-        <w:pStyle w:val="Prrafodelista"/>
-        <w:numPr>
-          <w:ilvl w:val="1"/>
-          <w:numId w:val="11"/>
-        </w:numPr>
-        <w:rPr>
-          <w:rFonts w:ascii="Arial" w:hAnsi="Arial" w:cs="Arial"/>
-        </w:rPr>
-      </w:pPr>
-      <w:r>
-        <w:rPr>
-          <w:rFonts w:ascii="Arial" w:hAnsi="Arial" w:cs="Arial"/>
-        </w:rPr>
-        <w:t>Instala paquetes: apache2 y apache2-utils</w:t>
-      </w:r>
-    </w:p>
-    <w:p>
-      <w:pPr>
-        <w:pStyle w:val="Prrafodelista"/>
-        <w:numPr>
-          <w:ilvl w:val="1"/>
-          <w:numId w:val="11"/>
-        </w:numPr>
-        <w:rPr>
-          <w:rFonts w:ascii="Arial" w:hAnsi="Arial" w:cs="Arial"/>
-        </w:rPr>
-      </w:pPr>
-      <w:r>
-        <w:rPr>
-          <w:rFonts w:ascii="Arial" w:hAnsi="Arial" w:cs="Arial"/>
-        </w:rPr>
-        <w:t>Configura puerto en /</w:t>
-      </w:r>
-      <w:proofErr w:type="spellStart"/>
-      <w:r>
-        <w:rPr>
-          <w:rFonts w:ascii="Arial" w:hAnsi="Arial" w:cs="Arial"/>
-        </w:rPr>
-        <w:t>etc</w:t>
-      </w:r>
-      <w:proofErr w:type="spellEnd"/>
-      <w:r>
-        <w:rPr>
-          <w:rFonts w:ascii="Arial" w:hAnsi="Arial" w:cs="Arial"/>
-        </w:rPr>
-        <w:t>/apache2/</w:t>
-      </w:r>
-      <w:proofErr w:type="spellStart"/>
-      <w:r>
-        <w:rPr>
-          <w:rFonts w:ascii="Arial" w:hAnsi="Arial" w:cs="Arial"/>
-        </w:rPr>
-        <w:t>listen.conf</w:t>
-      </w:r>
-      <w:proofErr w:type="spellEnd"/>
-    </w:p>
-    <w:p>
-      <w:pPr>
-        <w:pStyle w:val="Prrafodelista"/>
-        <w:numPr>
-          <w:ilvl w:val="1"/>
-          <w:numId w:val="11"/>
-        </w:numPr>
-        <w:rPr>
-          <w:rFonts w:ascii="Arial" w:hAnsi="Arial" w:cs="Arial"/>
-        </w:rPr>
-      </w:pPr>
-      <w:r>
-        <w:rPr>
-          <w:rFonts w:ascii="Arial" w:hAnsi="Arial" w:cs="Arial"/>
-        </w:rPr>
-        <w:t>Crea Virtual Host en /</w:t>
-      </w:r>
-      <w:proofErr w:type="spellStart"/>
-      <w:r>
-        <w:rPr>
-          <w:rFonts w:ascii="Arial" w:hAnsi="Arial" w:cs="Arial"/>
-        </w:rPr>
-        <w:t>etc</w:t>
-      </w:r>
-      <w:proofErr w:type="spellEnd"/>
-      <w:r>
-        <w:rPr>
-          <w:rFonts w:ascii="Arial" w:hAnsi="Arial" w:cs="Arial"/>
-        </w:rPr>
-        <w:t>/apache2/</w:t>
-      </w:r>
-      <w:proofErr w:type="spellStart"/>
-      <w:r>
-        <w:rPr>
-          <w:rFonts w:ascii="Arial" w:hAnsi="Arial" w:cs="Arial"/>
-        </w:rPr>
-        <w:t>vhosts.d</w:t>
-      </w:r>
-      <w:proofErr w:type="spellEnd"/>
-      <w:r>
-        <w:rPr>
-          <w:rFonts w:ascii="Arial" w:hAnsi="Arial" w:cs="Arial"/>
-        </w:rPr>
-        <w:t xml:space="preserve">/tarea6.conf con </w:t>
-      </w:r>
-      <w:proofErr w:type="spellStart"/>
-      <w:r>
-        <w:rPr>
-          <w:rFonts w:ascii="Arial" w:hAnsi="Arial" w:cs="Arial"/>
-        </w:rPr>
-        <w:t>DirectoryIndex</w:t>
-      </w:r>
-      <w:proofErr w:type="spellEnd"/>
-      <w:r>
-        <w:rPr>
-          <w:rFonts w:ascii="Arial" w:hAnsi="Arial" w:cs="Arial"/>
-        </w:rPr>
-        <w:t>, opciones de seguridad</w:t>
-      </w:r>
-    </w:p>
-    <w:p>
-      <w:pPr>
-        <w:pStyle w:val="Prrafodelista"/>
-        <w:numPr>
-          <w:ilvl w:val="1"/>
-          <w:numId w:val="11"/>
-        </w:numPr>
-        <w:rPr>
-          <w:rFonts w:ascii="Arial" w:hAnsi="Arial" w:cs="Arial"/>
-        </w:rPr>
-      </w:pPr>
-      <w:r>
-        <w:rPr>
-          <w:rFonts w:ascii="Arial" w:hAnsi="Arial" w:cs="Arial"/>
-        </w:rPr>
-        <w:t xml:space="preserve">Configura </w:t>
-      </w:r>
-      <w:proofErr w:type="spellStart"/>
-      <w:r>
-        <w:rPr>
-          <w:rFonts w:ascii="Arial" w:hAnsi="Arial" w:cs="Arial"/>
-        </w:rPr>
-        <w:t>headers</w:t>
-      </w:r>
-      <w:proofErr w:type="spellEnd"/>
-      <w:r>
-        <w:rPr>
-          <w:rFonts w:ascii="Arial" w:hAnsi="Arial" w:cs="Arial"/>
-        </w:rPr>
-        <w:t xml:space="preserve"> de seguridad en /</w:t>
-      </w:r>
-      <w:proofErr w:type="spellStart"/>
-      <w:r>
-        <w:rPr>
-          <w:rFonts w:ascii="Arial" w:hAnsi="Arial" w:cs="Arial"/>
-        </w:rPr>
-        <w:t>etc</w:t>
-      </w:r>
-      <w:proofErr w:type="spellEnd"/>
-      <w:r>
-        <w:rPr>
-          <w:rFonts w:ascii="Arial" w:hAnsi="Arial" w:cs="Arial"/>
-        </w:rPr>
-        <w:t>/apache2/</w:t>
-      </w:r>
-      <w:proofErr w:type="spellStart"/>
-      <w:r>
-        <w:rPr>
-          <w:rFonts w:ascii="Arial" w:hAnsi="Arial" w:cs="Arial"/>
-        </w:rPr>
-        <w:t>conf.d</w:t>
-      </w:r>
-      <w:proofErr w:type="spellEnd"/>
-      <w:r>
-        <w:rPr>
-          <w:rFonts w:ascii="Arial" w:hAnsi="Arial" w:cs="Arial"/>
-        </w:rPr>
-        <w:t>/</w:t>
-      </w:r>
-      <w:proofErr w:type="spellStart"/>
-      <w:r>
-        <w:rPr>
-          <w:rFonts w:ascii="Arial" w:hAnsi="Arial" w:cs="Arial"/>
-        </w:rPr>
-        <w:t>security.conf</w:t>
-      </w:r>
-      <w:proofErr w:type="spellEnd"/>
-      <w:r>
-        <w:rPr>
-          <w:rFonts w:ascii="Arial" w:hAnsi="Arial" w:cs="Arial"/>
-        </w:rPr>
-        <w:t>: X-</w:t>
-      </w:r>
-      <w:proofErr w:type="gramStart"/>
-      <w:r>
-        <w:rPr>
-          <w:rFonts w:ascii="Arial" w:hAnsi="Arial" w:cs="Arial"/>
-        </w:rPr>
-        <w:t>Frame</w:t>
-      </w:r>
-      <w:proofErr w:type="gramEnd"/>
-      <w:r>
-        <w:rPr>
-          <w:rFonts w:ascii="Arial" w:hAnsi="Arial" w:cs="Arial"/>
-        </w:rPr>
-        <w:t>-</w:t>
-      </w:r>
-      <w:proofErr w:type="spellStart"/>
-      <w:r>
-        <w:rPr>
-          <w:rFonts w:ascii="Arial" w:hAnsi="Arial" w:cs="Arial"/>
-        </w:rPr>
-        <w:t>Options</w:t>
-      </w:r>
-      <w:proofErr w:type="spellEnd"/>
-      <w:r>
-        <w:rPr>
-          <w:rFonts w:ascii="Arial" w:hAnsi="Arial" w:cs="Arial"/>
-        </w:rPr>
-        <w:t>, X-Content-</w:t>
-      </w:r>
-      <w:proofErr w:type="spellStart"/>
-      <w:r>
-        <w:rPr>
-          <w:rFonts w:ascii="Arial" w:hAnsi="Arial" w:cs="Arial"/>
-        </w:rPr>
-        <w:t>Type</w:t>
-      </w:r>
-      <w:proofErr w:type="spellEnd"/>
-      <w:r>
-        <w:rPr>
-          <w:rFonts w:ascii="Arial" w:hAnsi="Arial" w:cs="Arial"/>
-        </w:rPr>
-        <w:t>-</w:t>
-      </w:r>
-      <w:proofErr w:type="spellStart"/>
-      <w:r>
-        <w:rPr>
-          <w:rFonts w:ascii="Arial" w:hAnsi="Arial" w:cs="Arial"/>
-        </w:rPr>
-        <w:t>Options</w:t>
-      </w:r>
-      <w:proofErr w:type="spellEnd"/>
-    </w:p>
-    <w:p>
-      <w:pPr>
-        <w:pStyle w:val="Prrafodelista"/>
-        <w:numPr>
-          <w:ilvl w:val="1"/>
-          <w:numId w:val="11"/>
-        </w:numPr>
-        <w:rPr>
-          <w:rFonts w:ascii="Arial" w:hAnsi="Arial" w:cs="Arial"/>
-        </w:rPr>
-      </w:pPr>
-      <w:r>
-        <w:rPr>
-          <w:rFonts w:ascii="Arial" w:hAnsi="Arial" w:cs="Arial"/>
-        </w:rPr>
-        <w:t xml:space="preserve">Establece </w:t>
-      </w:r>
-      <w:proofErr w:type="spellStart"/>
-      <w:r>
-        <w:rPr>
-          <w:rFonts w:ascii="Arial" w:hAnsi="Arial" w:cs="Arial"/>
-        </w:rPr>
-        <w:t>ServerTokens</w:t>
-      </w:r>
-      <w:proofErr w:type="spellEnd"/>
-      <w:r>
-        <w:rPr>
-          <w:rFonts w:ascii="Arial" w:hAnsi="Arial" w:cs="Arial"/>
-        </w:rPr>
-        <w:t xml:space="preserve"> </w:t>
-      </w:r>
-      <w:proofErr w:type="spellStart"/>
-      <w:r>
-        <w:rPr>
-          <w:rFonts w:ascii="Arial" w:hAnsi="Arial" w:cs="Arial"/>
-        </w:rPr>
-        <w:t>Prod</w:t>
-      </w:r>
-      <w:proofErr w:type="spellEnd"/>
-      <w:r>
-        <w:rPr>
-          <w:rFonts w:ascii="Arial" w:hAnsi="Arial" w:cs="Arial"/>
-        </w:rPr>
-        <w:t xml:space="preserve"> y </w:t>
-      </w:r>
-      <w:proofErr w:type="spellStart"/>
-      <w:r>
-        <w:rPr>
-          <w:rFonts w:ascii="Arial" w:hAnsi="Arial" w:cs="Arial"/>
-        </w:rPr>
-        <w:t>ServerSignature</w:t>
-      </w:r>
-      <w:proofErr w:type="spellEnd"/>
-      <w:r>
-        <w:rPr>
-          <w:rFonts w:ascii="Arial" w:hAnsi="Arial" w:cs="Arial"/>
-        </w:rPr>
-        <w:t xml:space="preserve"> Off</w:t>
-      </w:r>
-    </w:p>
-    <w:p>
-      <w:pPr>
-        <w:pStyle w:val="Prrafodelista"/>
-        <w:numPr>
-          <w:ilvl w:val="1"/>
-          <w:numId w:val="11"/>
-        </w:numPr>
-        <w:rPr>
-          <w:rFonts w:ascii="Arial" w:hAnsi="Arial" w:cs="Arial"/>
-        </w:rPr>
-      </w:pPr>
-      <w:r>
-        <w:rPr>
-          <w:rFonts w:ascii="Arial" w:hAnsi="Arial" w:cs="Arial"/>
-        </w:rPr>
-        <w:lastRenderedPageBreak/>
-        <w:t xml:space="preserve">Crea </w:t>
-      </w:r>
-      <w:proofErr w:type="spellStart"/>
-      <w:r>
-        <w:rPr>
-          <w:rFonts w:ascii="Arial" w:hAnsi="Arial" w:cs="Arial"/>
-        </w:rPr>
-        <w:t>DocumentRoot</w:t>
-      </w:r>
-      <w:proofErr w:type="spellEnd"/>
-      <w:r>
-        <w:rPr>
-          <w:rFonts w:ascii="Arial" w:hAnsi="Arial" w:cs="Arial"/>
-        </w:rPr>
-        <w:t xml:space="preserve"> en /</w:t>
-      </w:r>
-      <w:proofErr w:type="spellStart"/>
-      <w:r>
-        <w:rPr>
-          <w:rFonts w:ascii="Arial" w:hAnsi="Arial" w:cs="Arial"/>
-        </w:rPr>
-        <w:t>srv</w:t>
-      </w:r>
-      <w:proofErr w:type="spellEnd"/>
-      <w:r>
-        <w:rPr>
-          <w:rFonts w:ascii="Arial" w:hAnsi="Arial" w:cs="Arial"/>
-        </w:rPr>
-        <w:t xml:space="preserve">/www/apache con permisos 750 y </w:t>
-      </w:r>
-      <w:proofErr w:type="spellStart"/>
-      <w:r>
-        <w:rPr>
-          <w:rFonts w:ascii="Arial" w:hAnsi="Arial" w:cs="Arial"/>
-        </w:rPr>
-        <w:t>owner</w:t>
-      </w:r>
-      <w:proofErr w:type="spellEnd"/>
-      <w:r>
-        <w:rPr>
-          <w:rFonts w:ascii="Arial" w:hAnsi="Arial" w:cs="Arial"/>
-        </w:rPr>
-        <w:t xml:space="preserve"> </w:t>
-      </w:r>
-      <w:proofErr w:type="spellStart"/>
-      <w:proofErr w:type="gramStart"/>
-      <w:r>
-        <w:rPr>
-          <w:rFonts w:ascii="Arial" w:hAnsi="Arial" w:cs="Arial"/>
-        </w:rPr>
-        <w:t>wwwrun:www</w:t>
-      </w:r>
-      <w:proofErr w:type="spellEnd"/>
-      <w:proofErr w:type="gramEnd"/>
-    </w:p>
-    <w:p>
-      <w:pPr>
-        <w:pStyle w:val="Prrafodelista"/>
-        <w:numPr>
-          <w:ilvl w:val="1"/>
-          <w:numId w:val="11"/>
-        </w:numPr>
-        <w:rPr>
-          <w:rFonts w:ascii="Arial" w:hAnsi="Arial" w:cs="Arial"/>
-        </w:rPr>
-      </w:pPr>
-      <w:proofErr w:type="gramStart"/>
-      <w:r>
-        <w:rPr>
-          <w:rFonts w:ascii="Arial" w:hAnsi="Arial" w:cs="Arial"/>
-        </w:rPr>
-        <w:t>Habilita puerto</w:t>
-      </w:r>
-      <w:proofErr w:type="gramEnd"/>
-      <w:r>
-        <w:rPr>
-          <w:rFonts w:ascii="Arial" w:hAnsi="Arial" w:cs="Arial"/>
-        </w:rPr>
-        <w:t xml:space="preserve"> en firewall y SELinux</w:t>
-      </w:r>
-    </w:p>
-    <w:p>
-      <w:pPr>
-        <w:pStyle w:val="Prrafodelista"/>
-        <w:numPr>
-          <w:ilvl w:val="0"/>
-          <w:numId w:val="11"/>
-        </w:numPr>
-        <w:rPr>
-          <w:rFonts w:ascii="Arial" w:hAnsi="Arial" w:cs="Arial"/>
-        </w:rPr>
-      </w:pPr>
-      <w:r>
-        <w:rPr>
-          <w:rFonts w:ascii="Arial" w:hAnsi="Arial" w:cs="Arial"/>
-        </w:rPr>
-        <w:t xml:space="preserve">Para </w:t>
-      </w:r>
-      <w:proofErr w:type="spellStart"/>
-      <w:r>
-        <w:rPr>
-          <w:rFonts w:ascii="Arial" w:hAnsi="Arial" w:cs="Arial"/>
-        </w:rPr>
-        <w:t>Nginx</w:t>
-      </w:r>
-      <w:proofErr w:type="spellEnd"/>
-      <w:r>
-        <w:rPr>
-          <w:rFonts w:ascii="Arial" w:hAnsi="Arial" w:cs="Arial"/>
-        </w:rPr>
-        <w:t>, el script:</w:t>
-      </w:r>
-    </w:p>
-    <w:p>
-      <w:pPr>
-        <w:pStyle w:val="Prrafodelista"/>
-        <w:numPr>
-          <w:ilvl w:val="1"/>
-          <w:numId w:val="11"/>
-        </w:numPr>
-        <w:rPr>
-          <w:rFonts w:ascii="Arial" w:hAnsi="Arial" w:cs="Arial"/>
-        </w:rPr>
-      </w:pPr>
-      <w:r>
-        <w:rPr>
-          <w:rFonts w:ascii="Arial" w:hAnsi="Arial" w:cs="Arial"/>
-        </w:rPr>
-        <w:t xml:space="preserve">Instala paquete </w:t>
-      </w:r>
-      <w:proofErr w:type="spellStart"/>
-      <w:r>
-        <w:rPr>
-          <w:rFonts w:ascii="Arial" w:hAnsi="Arial" w:cs="Arial"/>
-        </w:rPr>
-        <w:t>nginx</w:t>
-      </w:r>
-      <w:proofErr w:type="spellEnd"/>
-    </w:p>
-    <w:p>
-      <w:pPr>
-        <w:pStyle w:val="Prrafodelista"/>
-        <w:numPr>
-          <w:ilvl w:val="1"/>
-          <w:numId w:val="11"/>
-        </w:numPr>
-        <w:rPr>
-          <w:rFonts w:ascii="Arial" w:hAnsi="Arial" w:cs="Arial"/>
-        </w:rPr>
-      </w:pPr>
-      <w:r>
-        <w:rPr>
-          <w:rFonts w:ascii="Arial" w:hAnsi="Arial" w:cs="Arial"/>
-        </w:rPr>
-        <w:t>Crea usuario dedicado www-</w:t>
-      </w:r>
-      <w:proofErr w:type="spellStart"/>
-      <w:r>
-        <w:rPr>
-          <w:rFonts w:ascii="Arial" w:hAnsi="Arial" w:cs="Arial"/>
-        </w:rPr>
-        <w:t>nginx</w:t>
-      </w:r>
-      <w:proofErr w:type="spellEnd"/>
-    </w:p>
-    <w:p>
-      <w:pPr>
-        <w:pStyle w:val="Prrafodelista"/>
-        <w:numPr>
-          <w:ilvl w:val="1"/>
-          <w:numId w:val="11"/>
-        </w:numPr>
-        <w:rPr>
-          <w:rFonts w:ascii="Arial" w:hAnsi="Arial" w:cs="Arial"/>
-        </w:rPr>
-      </w:pPr>
-      <w:r>
-        <w:rPr>
-          <w:rFonts w:ascii="Arial" w:hAnsi="Arial" w:cs="Arial"/>
-        </w:rPr>
-        <w:t xml:space="preserve">Configura </w:t>
-      </w:r>
-      <w:proofErr w:type="spellStart"/>
-      <w:r>
-        <w:rPr>
-          <w:rFonts w:ascii="Arial" w:hAnsi="Arial" w:cs="Arial"/>
-        </w:rPr>
-        <w:t>nginx.conf</w:t>
-      </w:r>
-      <w:proofErr w:type="spellEnd"/>
-      <w:r>
-        <w:rPr>
-          <w:rFonts w:ascii="Arial" w:hAnsi="Arial" w:cs="Arial"/>
-        </w:rPr>
-        <w:t xml:space="preserve"> con </w:t>
-      </w:r>
-      <w:proofErr w:type="spellStart"/>
-      <w:r>
-        <w:rPr>
-          <w:rFonts w:ascii="Arial" w:hAnsi="Arial" w:cs="Arial"/>
-        </w:rPr>
-        <w:t>worker_processes</w:t>
-      </w:r>
-      <w:proofErr w:type="spellEnd"/>
-      <w:r>
-        <w:rPr>
-          <w:rFonts w:ascii="Arial" w:hAnsi="Arial" w:cs="Arial"/>
-        </w:rPr>
-        <w:t xml:space="preserve"> auto, </w:t>
-      </w:r>
-      <w:proofErr w:type="spellStart"/>
-      <w:r>
-        <w:rPr>
-          <w:rFonts w:ascii="Arial" w:hAnsi="Arial" w:cs="Arial"/>
-        </w:rPr>
-        <w:t>worker_connections</w:t>
-      </w:r>
-      <w:proofErr w:type="spellEnd"/>
-    </w:p>
-    <w:p>
-      <w:pPr>
-        <w:pStyle w:val="Prrafodelista"/>
-        <w:numPr>
-          <w:ilvl w:val="1"/>
-          <w:numId w:val="11"/>
-        </w:numPr>
-        <w:rPr>
-          <w:rFonts w:ascii="Arial" w:hAnsi="Arial" w:cs="Arial"/>
-        </w:rPr>
-      </w:pPr>
-      <w:r>
-        <w:rPr>
-          <w:rFonts w:ascii="Arial" w:hAnsi="Arial" w:cs="Arial"/>
-        </w:rPr>
-        <w:t>Crea Server Block en /</w:t>
-      </w:r>
-      <w:proofErr w:type="spellStart"/>
-      <w:r>
-        <w:rPr>
-          <w:rFonts w:ascii="Arial" w:hAnsi="Arial" w:cs="Arial"/>
-        </w:rPr>
-        <w:t>etc</w:t>
-      </w:r>
-      <w:proofErr w:type="spellEnd"/>
-      <w:r>
-        <w:rPr>
-          <w:rFonts w:ascii="Arial" w:hAnsi="Arial" w:cs="Arial"/>
-        </w:rPr>
-        <w:t>/</w:t>
-      </w:r>
-      <w:proofErr w:type="spellStart"/>
-      <w:r>
-        <w:rPr>
-          <w:rFonts w:ascii="Arial" w:hAnsi="Arial" w:cs="Arial"/>
-        </w:rPr>
-        <w:t>nginx</w:t>
-      </w:r>
-      <w:proofErr w:type="spellEnd"/>
-      <w:r>
-        <w:rPr>
-          <w:rFonts w:ascii="Arial" w:hAnsi="Arial" w:cs="Arial"/>
-        </w:rPr>
-        <w:t>/</w:t>
-      </w:r>
-      <w:proofErr w:type="spellStart"/>
-      <w:r>
-        <w:rPr>
-          <w:rFonts w:ascii="Arial" w:hAnsi="Arial" w:cs="Arial"/>
-        </w:rPr>
-        <w:t>conf.d</w:t>
-      </w:r>
-      <w:proofErr w:type="spellEnd"/>
-      <w:r>
-        <w:rPr>
-          <w:rFonts w:ascii="Arial" w:hAnsi="Arial" w:cs="Arial"/>
-        </w:rPr>
-        <w:t>/tarea6.conf</w:t>
-      </w:r>
-    </w:p>
-    <w:p>
-      <w:pPr>
-        <w:pStyle w:val="Prrafodelista"/>
-        <w:numPr>
-          <w:ilvl w:val="1"/>
-          <w:numId w:val="11"/>
-        </w:numPr>
-        <w:rPr>
-          <w:rFonts w:ascii="Arial" w:hAnsi="Arial" w:cs="Arial"/>
-        </w:rPr>
-      </w:pPr>
-      <w:r>
-        <w:rPr>
-          <w:rFonts w:ascii="Arial" w:hAnsi="Arial" w:cs="Arial"/>
-        </w:rPr>
-        <w:t xml:space="preserve">Configura </w:t>
-      </w:r>
-      <w:proofErr w:type="spellStart"/>
-      <w:r>
-        <w:rPr>
-          <w:rFonts w:ascii="Arial" w:hAnsi="Arial" w:cs="Arial"/>
-        </w:rPr>
-        <w:t>headers</w:t>
-      </w:r>
-      <w:proofErr w:type="spellEnd"/>
-      <w:r>
-        <w:rPr>
-          <w:rFonts w:ascii="Arial" w:hAnsi="Arial" w:cs="Arial"/>
-        </w:rPr>
-        <w:t xml:space="preserve"> con </w:t>
-      </w:r>
-      <w:proofErr w:type="spellStart"/>
-      <w:r>
-        <w:rPr>
-          <w:rFonts w:ascii="Arial" w:hAnsi="Arial" w:cs="Arial"/>
-        </w:rPr>
-        <w:t>add_header</w:t>
-      </w:r>
-      <w:proofErr w:type="spellEnd"/>
-      <w:r>
-        <w:rPr>
-          <w:rFonts w:ascii="Arial" w:hAnsi="Arial" w:cs="Arial"/>
-        </w:rPr>
-        <w:t xml:space="preserve"> (X-</w:t>
-      </w:r>
-      <w:proofErr w:type="gramStart"/>
-      <w:r>
-        <w:rPr>
-          <w:rFonts w:ascii="Arial" w:hAnsi="Arial" w:cs="Arial"/>
-        </w:rPr>
-        <w:t>Frame</w:t>
-      </w:r>
-      <w:proofErr w:type="gramEnd"/>
-      <w:r>
-        <w:rPr>
-          <w:rFonts w:ascii="Arial" w:hAnsi="Arial" w:cs="Arial"/>
-        </w:rPr>
-        <w:t>-</w:t>
-      </w:r>
-      <w:proofErr w:type="spellStart"/>
-      <w:r>
-        <w:rPr>
-          <w:rFonts w:ascii="Arial" w:hAnsi="Arial" w:cs="Arial"/>
-        </w:rPr>
-        <w:t>Options</w:t>
-      </w:r>
-      <w:proofErr w:type="spellEnd"/>
-      <w:r>
-        <w:rPr>
-          <w:rFonts w:ascii="Arial" w:hAnsi="Arial" w:cs="Arial"/>
-        </w:rPr>
-        <w:t>, X-Content-</w:t>
-      </w:r>
-      <w:proofErr w:type="spellStart"/>
-      <w:r>
-        <w:rPr>
-          <w:rFonts w:ascii="Arial" w:hAnsi="Arial" w:cs="Arial"/>
-        </w:rPr>
-        <w:t>Type</w:t>
-      </w:r>
-      <w:proofErr w:type="spellEnd"/>
-      <w:r>
-        <w:rPr>
-          <w:rFonts w:ascii="Arial" w:hAnsi="Arial" w:cs="Arial"/>
-        </w:rPr>
-        <w:t>-</w:t>
-      </w:r>
-      <w:proofErr w:type="spellStart"/>
-      <w:r>
-        <w:rPr>
-          <w:rFonts w:ascii="Arial" w:hAnsi="Arial" w:cs="Arial"/>
-        </w:rPr>
-        <w:t>Options</w:t>
-      </w:r>
-      <w:proofErr w:type="spellEnd"/>
-      <w:r>
-        <w:rPr>
-          <w:rFonts w:ascii="Arial" w:hAnsi="Arial" w:cs="Arial"/>
-        </w:rPr>
-        <w:t>)</w:t>
-      </w:r>
-    </w:p>
-    <w:p>
-      <w:pPr>
-        <w:pStyle w:val="Prrafodelista"/>
-        <w:numPr>
-          <w:ilvl w:val="1"/>
-          <w:numId w:val="11"/>
-        </w:numPr>
-        <w:rPr>
-          <w:rFonts w:ascii="Arial" w:hAnsi="Arial" w:cs="Arial"/>
-        </w:rPr>
-      </w:pPr>
-      <w:r>
-        <w:rPr>
-          <w:rFonts w:ascii="Arial" w:hAnsi="Arial" w:cs="Arial"/>
-        </w:rPr>
-        <w:t xml:space="preserve">Desactiva </w:t>
-      </w:r>
-      <w:proofErr w:type="spellStart"/>
-      <w:r>
-        <w:rPr>
-          <w:rFonts w:ascii="Arial" w:hAnsi="Arial" w:cs="Arial"/>
-        </w:rPr>
-        <w:t>server_tokens</w:t>
-      </w:r>
-      <w:proofErr w:type="spellEnd"/>
-      <w:r>
-        <w:rPr>
-          <w:rFonts w:ascii="Arial" w:hAnsi="Arial" w:cs="Arial"/>
-        </w:rPr>
-        <w:t xml:space="preserve"> para ocultar versión</w:t>
-      </w:r>
-    </w:p>
-    <w:p>
-      <w:pPr>
-        <w:pStyle w:val="Prrafodelista"/>
-        <w:numPr>
-          <w:ilvl w:val="1"/>
-          <w:numId w:val="11"/>
-        </w:numPr>
-        <w:rPr>
-          <w:rFonts w:ascii="Arial" w:hAnsi="Arial" w:cs="Arial"/>
-        </w:rPr>
-      </w:pPr>
-      <w:r>
-        <w:rPr>
-          <w:rFonts w:ascii="Arial" w:hAnsi="Arial" w:cs="Arial"/>
-        </w:rPr>
-        <w:t xml:space="preserve">Crea </w:t>
-      </w:r>
-      <w:proofErr w:type="spellStart"/>
-      <w:r>
-        <w:rPr>
-          <w:rFonts w:ascii="Arial" w:hAnsi="Arial" w:cs="Arial"/>
-        </w:rPr>
-        <w:t>root</w:t>
-      </w:r>
-      <w:proofErr w:type="spellEnd"/>
-      <w:r>
-        <w:rPr>
-          <w:rFonts w:ascii="Arial" w:hAnsi="Arial" w:cs="Arial"/>
-        </w:rPr>
-        <w:t xml:space="preserve"> en /</w:t>
-      </w:r>
-      <w:proofErr w:type="spellStart"/>
-      <w:r>
-        <w:rPr>
-          <w:rFonts w:ascii="Arial" w:hAnsi="Arial" w:cs="Arial"/>
-        </w:rPr>
-        <w:t>srv</w:t>
-      </w:r>
-      <w:proofErr w:type="spellEnd"/>
-      <w:r>
-        <w:rPr>
-          <w:rFonts w:ascii="Arial" w:hAnsi="Arial" w:cs="Arial"/>
-        </w:rPr>
-        <w:t>/www/</w:t>
-      </w:r>
-      <w:proofErr w:type="spellStart"/>
-      <w:r>
-        <w:rPr>
-          <w:rFonts w:ascii="Arial" w:hAnsi="Arial" w:cs="Arial"/>
-        </w:rPr>
-        <w:t>nginx</w:t>
-      </w:r>
-      <w:proofErr w:type="spellEnd"/>
-      <w:r>
-        <w:rPr>
-          <w:rFonts w:ascii="Arial" w:hAnsi="Arial" w:cs="Arial"/>
-        </w:rPr>
-        <w:t xml:space="preserve"> con permisos 750 y </w:t>
-      </w:r>
-      <w:proofErr w:type="spellStart"/>
-      <w:r>
-        <w:rPr>
-          <w:rFonts w:ascii="Arial" w:hAnsi="Arial" w:cs="Arial"/>
-        </w:rPr>
-        <w:t>owner</w:t>
-      </w:r>
-      <w:proofErr w:type="spellEnd"/>
-      <w:r>
-        <w:rPr>
-          <w:rFonts w:ascii="Arial" w:hAnsi="Arial" w:cs="Arial"/>
-        </w:rPr>
-        <w:t xml:space="preserve"> </w:t>
-      </w:r>
-      <w:proofErr w:type="spellStart"/>
-      <w:r>
-        <w:rPr>
-          <w:rFonts w:ascii="Arial" w:hAnsi="Arial" w:cs="Arial"/>
-        </w:rPr>
-        <w:t>www-</w:t>
-      </w:r>
-      <w:proofErr w:type="gramStart"/>
-      <w:r>
-        <w:rPr>
-          <w:rFonts w:ascii="Arial" w:hAnsi="Arial" w:cs="Arial"/>
-        </w:rPr>
-        <w:t>nginx:www</w:t>
-      </w:r>
-      <w:proofErr w:type="gramEnd"/>
-      <w:r>
-        <w:rPr>
-          <w:rFonts w:ascii="Arial" w:hAnsi="Arial" w:cs="Arial"/>
-        </w:rPr>
-        <w:t>-nginx</w:t>
-      </w:r>
-      <w:proofErr w:type="spellEnd"/>
-    </w:p>
-    <w:p>
-      <w:pPr>
-        <w:pStyle w:val="Prrafodelista"/>
-        <w:numPr>
-          <w:ilvl w:val="0"/>
-          <w:numId w:val="11"/>
-        </w:numPr>
-        <w:rPr>
-          <w:rFonts w:ascii="Arial" w:hAnsi="Arial" w:cs="Arial"/>
-        </w:rPr>
-      </w:pPr>
-      <w:r>
-        <w:rPr>
-          <w:rFonts w:ascii="Arial" w:hAnsi="Arial" w:cs="Arial"/>
-        </w:rPr>
-        <w:t>Para Tomcat, el script:</w:t>
-      </w:r>
-    </w:p>
-    <w:p>
-      <w:pPr>
-        <w:pStyle w:val="Prrafodelista"/>
-        <w:numPr>
-          <w:ilvl w:val="1"/>
-          <w:numId w:val="11"/>
-        </w:numPr>
-        <w:rPr>
-          <w:rFonts w:ascii="Arial" w:hAnsi="Arial" w:cs="Arial"/>
-        </w:rPr>
-      </w:pPr>
-      <w:r>
-        <w:rPr>
-          <w:rFonts w:ascii="Arial" w:hAnsi="Arial" w:cs="Arial"/>
-        </w:rPr>
-        <w:t xml:space="preserve">Instala Java </w:t>
-      </w:r>
-      <w:proofErr w:type="spellStart"/>
-      <w:r>
-        <w:rPr>
-          <w:rFonts w:ascii="Arial" w:hAnsi="Arial" w:cs="Arial"/>
-        </w:rPr>
-        <w:t>OpenJDK</w:t>
-      </w:r>
-      <w:proofErr w:type="spellEnd"/>
-      <w:r>
-        <w:rPr>
-          <w:rFonts w:ascii="Arial" w:hAnsi="Arial" w:cs="Arial"/>
-        </w:rPr>
-        <w:t xml:space="preserve"> como requisito previo</w:t>
-      </w:r>
-    </w:p>
-    <w:p>
-      <w:pPr>
-        <w:pStyle w:val="Prrafodelista"/>
-        <w:numPr>
-          <w:ilvl w:val="1"/>
-          <w:numId w:val="11"/>
-        </w:numPr>
-        <w:rPr>
-          <w:rFonts w:ascii="Arial" w:hAnsi="Arial" w:cs="Arial"/>
-        </w:rPr>
-      </w:pPr>
-      <w:r>
-        <w:rPr>
-          <w:rFonts w:ascii="Arial" w:hAnsi="Arial" w:cs="Arial"/>
-        </w:rPr>
-        <w:t xml:space="preserve">Descarga </w:t>
-      </w:r>
-      <w:proofErr w:type="gramStart"/>
-      <w:r>
-        <w:rPr>
-          <w:rFonts w:ascii="Arial" w:hAnsi="Arial" w:cs="Arial"/>
-        </w:rPr>
-        <w:t>binarios .</w:t>
-      </w:r>
-      <w:proofErr w:type="gramEnd"/>
-      <w:r>
-        <w:rPr>
-          <w:rFonts w:ascii="Arial" w:hAnsi="Arial" w:cs="Arial"/>
-        </w:rPr>
-        <w:t>tar.gz desde dlcdn.apache.org</w:t>
-      </w:r>
-    </w:p>
-    <w:p>
-      <w:pPr>
-        <w:pStyle w:val="Prrafodelista"/>
-        <w:numPr>
-          <w:ilvl w:val="1"/>
-          <w:numId w:val="11"/>
-        </w:numPr>
-        <w:rPr>
-          <w:rFonts w:ascii="Arial" w:hAnsi="Arial" w:cs="Arial"/>
-        </w:rPr>
-      </w:pPr>
-      <w:r>
-        <w:rPr>
-          <w:rFonts w:ascii="Arial" w:hAnsi="Arial" w:cs="Arial"/>
-        </w:rPr>
-        <w:t>Extrae en /</w:t>
-      </w:r>
-      <w:proofErr w:type="spellStart"/>
-      <w:r>
-        <w:rPr>
-          <w:rFonts w:ascii="Arial" w:hAnsi="Arial" w:cs="Arial"/>
-        </w:rPr>
-        <w:t>opt</w:t>
-      </w:r>
-      <w:proofErr w:type="spellEnd"/>
-      <w:r>
-        <w:rPr>
-          <w:rFonts w:ascii="Arial" w:hAnsi="Arial" w:cs="Arial"/>
-        </w:rPr>
-        <w:t>/</w:t>
-      </w:r>
-      <w:proofErr w:type="spellStart"/>
-      <w:r>
-        <w:rPr>
-          <w:rFonts w:ascii="Arial" w:hAnsi="Arial" w:cs="Arial"/>
-        </w:rPr>
-        <w:t>tomcat</w:t>
-      </w:r>
-      <w:proofErr w:type="spellEnd"/>
-    </w:p>
-    <w:p>
-      <w:pPr>
-        <w:pStyle w:val="Prrafodelista"/>
-        <w:numPr>
-          <w:ilvl w:val="1"/>
-          <w:numId w:val="11"/>
-        </w:numPr>
-        <w:rPr>
-          <w:rFonts w:ascii="Arial" w:hAnsi="Arial" w:cs="Arial"/>
-        </w:rPr>
-      </w:pPr>
-      <w:r>
-        <w:rPr>
-          <w:rFonts w:ascii="Arial" w:hAnsi="Arial" w:cs="Arial"/>
-        </w:rPr>
-        <w:t xml:space="preserve">Crea usuario </w:t>
-      </w:r>
-      <w:proofErr w:type="spellStart"/>
-      <w:r>
-        <w:rPr>
-          <w:rFonts w:ascii="Arial" w:hAnsi="Arial" w:cs="Arial"/>
-        </w:rPr>
-        <w:t>tomcat</w:t>
-      </w:r>
-      <w:proofErr w:type="spellEnd"/>
-      <w:r>
-        <w:rPr>
-          <w:rFonts w:ascii="Arial" w:hAnsi="Arial" w:cs="Arial"/>
-        </w:rPr>
-        <w:t xml:space="preserve"> dedicado</w:t>
-      </w:r>
-    </w:p>
-    <w:p>
-      <w:pPr>
-        <w:pStyle w:val="Prrafodelista"/>
-        <w:numPr>
-          <w:ilvl w:val="1"/>
-          <w:numId w:val="11"/>
-        </w:numPr>
-        <w:rPr>
-          <w:rFonts w:ascii="Arial" w:hAnsi="Arial" w:cs="Arial"/>
-        </w:rPr>
-      </w:pPr>
-      <w:r>
-        <w:rPr>
-          <w:rFonts w:ascii="Arial" w:hAnsi="Arial" w:cs="Arial"/>
-        </w:rPr>
-        <w:t xml:space="preserve">Modifica </w:t>
-      </w:r>
-      <w:proofErr w:type="spellStart"/>
-      <w:r>
-        <w:rPr>
-          <w:rFonts w:ascii="Arial" w:hAnsi="Arial" w:cs="Arial"/>
-        </w:rPr>
-        <w:t>conf</w:t>
-      </w:r>
-      <w:proofErr w:type="spellEnd"/>
-      <w:r>
-        <w:rPr>
-          <w:rFonts w:ascii="Arial" w:hAnsi="Arial" w:cs="Arial"/>
-        </w:rPr>
-        <w:t xml:space="preserve">/server.xml para configurar puerto y desactivar shutdown </w:t>
-      </w:r>
-      <w:proofErr w:type="spellStart"/>
-      <w:r>
-        <w:rPr>
-          <w:rFonts w:ascii="Arial" w:hAnsi="Arial" w:cs="Arial"/>
-        </w:rPr>
-        <w:t>port</w:t>
-      </w:r>
-      <w:proofErr w:type="spellEnd"/>
-    </w:p>
-    <w:p>
-      <w:pPr>
-        <w:pStyle w:val="Prrafodelista"/>
-        <w:numPr>
-          <w:ilvl w:val="1"/>
-          <w:numId w:val="11"/>
-        </w:numPr>
-        <w:rPr>
-          <w:rFonts w:ascii="Arial" w:hAnsi="Arial" w:cs="Arial"/>
-        </w:rPr>
-      </w:pPr>
-      <w:r>
-        <w:rPr>
-          <w:rFonts w:ascii="Arial" w:hAnsi="Arial" w:cs="Arial"/>
-        </w:rPr>
-        <w:t xml:space="preserve">Crea servicio </w:t>
-      </w:r>
-      <w:proofErr w:type="spellStart"/>
-      <w:r>
-        <w:rPr>
-          <w:rFonts w:ascii="Arial" w:hAnsi="Arial" w:cs="Arial"/>
-        </w:rPr>
-        <w:t>systemd</w:t>
-      </w:r>
-      <w:proofErr w:type="spellEnd"/>
-      <w:r>
-        <w:rPr>
-          <w:rFonts w:ascii="Arial" w:hAnsi="Arial" w:cs="Arial"/>
-        </w:rPr>
-        <w:t xml:space="preserve"> en /</w:t>
-      </w:r>
-      <w:proofErr w:type="spellStart"/>
-      <w:r>
-        <w:rPr>
-          <w:rFonts w:ascii="Arial" w:hAnsi="Arial" w:cs="Arial"/>
-        </w:rPr>
-        <w:t>etc</w:t>
-      </w:r>
-      <w:proofErr w:type="spellEnd"/>
-      <w:r>
-        <w:rPr>
-          <w:rFonts w:ascii="Arial" w:hAnsi="Arial" w:cs="Arial"/>
-        </w:rPr>
-        <w:t>/</w:t>
-      </w:r>
-      <w:proofErr w:type="spellStart"/>
-      <w:r>
-        <w:rPr>
-          <w:rFonts w:ascii="Arial" w:hAnsi="Arial" w:cs="Arial"/>
-        </w:rPr>
-        <w:t>systemd</w:t>
-      </w:r>
-      <w:proofErr w:type="spellEnd"/>
-      <w:r>
-        <w:rPr>
-          <w:rFonts w:ascii="Arial" w:hAnsi="Arial" w:cs="Arial"/>
-        </w:rPr>
-        <w:t>/</w:t>
-      </w:r>
-      <w:proofErr w:type="spellStart"/>
-      <w:r>
-        <w:rPr>
-          <w:rFonts w:ascii="Arial" w:hAnsi="Arial" w:cs="Arial"/>
-        </w:rPr>
-        <w:t>system</w:t>
-      </w:r>
-      <w:proofErr w:type="spellEnd"/>
-      <w:r>
-        <w:rPr>
-          <w:rFonts w:ascii="Arial" w:hAnsi="Arial" w:cs="Arial"/>
-        </w:rPr>
-        <w:t>/</w:t>
-      </w:r>
-      <w:proofErr w:type="spellStart"/>
-      <w:r>
-        <w:rPr>
-          <w:rFonts w:ascii="Arial" w:hAnsi="Arial" w:cs="Arial"/>
-        </w:rPr>
-        <w:t>tomcat.service</w:t>
-      </w:r>
-      <w:proofErr w:type="spellEnd"/>
-    </w:p>
-    <w:p>
-      <w:pPr>
-        <w:pStyle w:val="Prrafodelista"/>
-        <w:numPr>
-          <w:ilvl w:val="1"/>
-          <w:numId w:val="11"/>
-        </w:numPr>
-        <w:rPr>
-          <w:rFonts w:ascii="Arial" w:hAnsi="Arial" w:cs="Arial"/>
-        </w:rPr>
-      </w:pPr>
-      <w:r>
-        <w:rPr>
-          <w:rFonts w:ascii="Arial" w:hAnsi="Arial" w:cs="Arial"/>
-        </w:rPr>
-        <w:t>Establece variables JAVA_HOME y CATALINA_HOME</w:t>
-      </w:r>
-    </w:p>
-    <w:p>
-      <w:pPr>
-        <w:pStyle w:val="Prrafodelista"/>
-        <w:numPr>
-          <w:ilvl w:val="1"/>
-          <w:numId w:val="11"/>
-        </w:numPr>
-        <w:rPr>
-          <w:rFonts w:ascii="Arial" w:hAnsi="Arial" w:cs="Arial"/>
-        </w:rPr>
-      </w:pPr>
-      <w:r>
-        <w:rPr>
-          <w:rFonts w:ascii="Arial" w:hAnsi="Arial" w:cs="Arial"/>
-        </w:rPr>
-        <w:t xml:space="preserve">Aplica permisos </w:t>
-      </w:r>
-      <w:proofErr w:type="spellStart"/>
-      <w:r>
-        <w:rPr>
-          <w:rFonts w:ascii="Arial" w:hAnsi="Arial" w:cs="Arial"/>
-        </w:rPr>
-        <w:t>chown</w:t>
-      </w:r>
-      <w:proofErr w:type="spellEnd"/>
-      <w:r>
-        <w:rPr>
-          <w:rFonts w:ascii="Arial" w:hAnsi="Arial" w:cs="Arial"/>
-        </w:rPr>
-        <w:t xml:space="preserve"> -R </w:t>
-      </w:r>
-      <w:proofErr w:type="spellStart"/>
-      <w:proofErr w:type="gramStart"/>
-      <w:r>
-        <w:rPr>
-          <w:rFonts w:ascii="Arial" w:hAnsi="Arial" w:cs="Arial"/>
-        </w:rPr>
-        <w:t>tomcat:tomcat</w:t>
-      </w:r>
-      <w:proofErr w:type="spellEnd"/>
-      <w:proofErr w:type="gramEnd"/>
-      <w:r>
-        <w:rPr>
-          <w:rFonts w:ascii="Arial" w:hAnsi="Arial" w:cs="Arial"/>
-        </w:rPr>
-        <w:t xml:space="preserve"> /</w:t>
-      </w:r>
-      <w:proofErr w:type="spellStart"/>
-      <w:r>
-        <w:rPr>
-          <w:rFonts w:ascii="Arial" w:hAnsi="Arial" w:cs="Arial"/>
-        </w:rPr>
-        <w:t>opt</w:t>
-      </w:r>
-      <w:proofErr w:type="spellEnd"/>
-      <w:r>
-        <w:rPr>
-          <w:rFonts w:ascii="Arial" w:hAnsi="Arial" w:cs="Arial"/>
-        </w:rPr>
-        <w:t>/</w:t>
-      </w:r>
-      <w:proofErr w:type="spellStart"/>
-      <w:r>
-        <w:rPr>
-          <w:rFonts w:ascii="Arial" w:hAnsi="Arial" w:cs="Arial"/>
-        </w:rPr>
-        <w:t>tomcat</w:t>
-      </w:r>
-      <w:proofErr w:type="spellEnd"/>
-    </w:p>
-    <w:p>
-      <w:pPr>
-        <w:pStyle w:val="Prrafodelista"/>
-        <w:numPr>
-          <w:ilvl w:val="0"/>
-          <w:numId w:val="11"/>
-        </w:numPr>
-        <w:rPr>
-          <w:rFonts w:ascii="Arial" w:hAnsi="Arial" w:cs="Arial"/>
-        </w:rPr>
-      </w:pPr>
-      <w:r>
-        <w:rPr>
-          <w:rFonts w:ascii="Arial" w:hAnsi="Arial" w:cs="Arial"/>
-        </w:rPr>
-        <w:t>La opción -v (verificar) muestra:</w:t>
-      </w:r>
-    </w:p>
-    <w:p>
-      <w:pPr>
-        <w:pStyle w:val="Prrafodelista"/>
-        <w:numPr>
-          <w:ilvl w:val="1"/>
-          <w:numId w:val="11"/>
-        </w:numPr>
-        <w:rPr>
-          <w:rFonts w:ascii="Arial" w:hAnsi="Arial" w:cs="Arial"/>
-        </w:rPr>
-      </w:pPr>
-      <w:r>
-        <w:rPr>
-          <w:rFonts w:ascii="Arial" w:hAnsi="Arial" w:cs="Arial"/>
-        </w:rPr>
-        <w:t xml:space="preserve">Estado de servicios: </w:t>
-      </w:r>
-      <w:proofErr w:type="spellStart"/>
-      <w:r>
-        <w:rPr>
-          <w:rFonts w:ascii="Arial" w:hAnsi="Arial" w:cs="Arial"/>
-        </w:rPr>
-        <w:t>systemctl</w:t>
-      </w:r>
-      <w:proofErr w:type="spellEnd"/>
-      <w:r>
-        <w:rPr>
-          <w:rFonts w:ascii="Arial" w:hAnsi="Arial" w:cs="Arial"/>
-        </w:rPr>
-        <w:t xml:space="preserve"> </w:t>
-      </w:r>
-      <w:proofErr w:type="gramStart"/>
-      <w:r>
-        <w:rPr>
-          <w:rFonts w:ascii="Arial" w:hAnsi="Arial" w:cs="Arial"/>
-        </w:rPr>
-        <w:t>status</w:t>
-      </w:r>
-      <w:proofErr w:type="gramEnd"/>
-      <w:r>
-        <w:rPr>
-          <w:rFonts w:ascii="Arial" w:hAnsi="Arial" w:cs="Arial"/>
-        </w:rPr>
-        <w:t xml:space="preserve"> apache2/</w:t>
-      </w:r>
-      <w:proofErr w:type="spellStart"/>
-      <w:r>
-        <w:rPr>
-          <w:rFonts w:ascii="Arial" w:hAnsi="Arial" w:cs="Arial"/>
-        </w:rPr>
-        <w:t>nginx</w:t>
-      </w:r>
-      <w:proofErr w:type="spellEnd"/>
-      <w:r>
-        <w:rPr>
-          <w:rFonts w:ascii="Arial" w:hAnsi="Arial" w:cs="Arial"/>
-        </w:rPr>
-        <w:t>/</w:t>
-      </w:r>
-      <w:proofErr w:type="spellStart"/>
-      <w:r>
-        <w:rPr>
-          <w:rFonts w:ascii="Arial" w:hAnsi="Arial" w:cs="Arial"/>
-        </w:rPr>
-        <w:t>tomcat</w:t>
-      </w:r>
-      <w:proofErr w:type="spellEnd"/>
-    </w:p>
-    <w:p>
-      <w:pPr>
-        <w:pStyle w:val="Prrafodelista"/>
-        <w:numPr>
-          <w:ilvl w:val="1"/>
-          <w:numId w:val="11"/>
-        </w:numPr>
-        <w:rPr>
-          <w:rFonts w:ascii="Arial" w:hAnsi="Arial" w:cs="Arial"/>
-        </w:rPr>
-      </w:pPr>
-      <w:r>
-        <w:rPr>
-          <w:rFonts w:ascii="Arial" w:hAnsi="Arial" w:cs="Arial"/>
-        </w:rPr>
-        <w:t xml:space="preserve">Puertos en escucha: </w:t>
-      </w:r>
-      <w:proofErr w:type="spellStart"/>
-      <w:r>
-        <w:rPr>
-          <w:rFonts w:ascii="Arial" w:hAnsi="Arial" w:cs="Arial"/>
-        </w:rPr>
-        <w:t>ss</w:t>
-      </w:r>
-      <w:proofErr w:type="spellEnd"/>
-      <w:r>
-        <w:rPr>
-          <w:rFonts w:ascii="Arial" w:hAnsi="Arial" w:cs="Arial"/>
-        </w:rPr>
-        <w:t xml:space="preserve"> -</w:t>
-      </w:r>
-      <w:proofErr w:type="spellStart"/>
-      <w:r>
-        <w:rPr>
-          <w:rFonts w:ascii="Arial" w:hAnsi="Arial" w:cs="Arial"/>
-        </w:rPr>
-        <w:t>tulnp</w:t>
-      </w:r>
-      <w:proofErr w:type="spellEnd"/>
-      <w:r>
-        <w:rPr>
-          <w:rFonts w:ascii="Arial" w:hAnsi="Arial" w:cs="Arial"/>
-        </w:rPr>
-        <w:t xml:space="preserve"> | grep LISTEN</w:t>
-      </w:r>
-    </w:p>
-    <w:p>
-      <w:pPr>
-        <w:pStyle w:val="Prrafodelista"/>
-        <w:numPr>
-          <w:ilvl w:val="1"/>
-          <w:numId w:val="11"/>
-        </w:numPr>
-        <w:rPr>
-          <w:rFonts w:ascii="Arial" w:hAnsi="Arial" w:cs="Arial"/>
-        </w:rPr>
-      </w:pPr>
-      <w:r>
-        <w:rPr>
-          <w:rFonts w:ascii="Arial" w:hAnsi="Arial" w:cs="Arial"/>
-        </w:rPr>
-        <w:t xml:space="preserve">Procesos activos: </w:t>
-      </w:r>
-      <w:proofErr w:type="spellStart"/>
-      <w:r>
-        <w:rPr>
-          <w:rFonts w:ascii="Arial" w:hAnsi="Arial" w:cs="Arial"/>
-        </w:rPr>
-        <w:t>ps</w:t>
-      </w:r>
-      <w:proofErr w:type="spellEnd"/>
-      <w:r>
-        <w:rPr>
-          <w:rFonts w:ascii="Arial" w:hAnsi="Arial" w:cs="Arial"/>
-        </w:rPr>
-        <w:t xml:space="preserve"> </w:t>
-      </w:r>
-      <w:proofErr w:type="spellStart"/>
-      <w:r>
-        <w:rPr>
-          <w:rFonts w:ascii="Arial" w:hAnsi="Arial" w:cs="Arial"/>
-        </w:rPr>
-        <w:t>aux</w:t>
-      </w:r>
-      <w:proofErr w:type="spellEnd"/>
-      <w:r>
-        <w:rPr>
-          <w:rFonts w:ascii="Arial" w:hAnsi="Arial" w:cs="Arial"/>
-        </w:rPr>
-        <w:t xml:space="preserve"> | grep </w:t>
-      </w:r>
-      <w:proofErr w:type="spellStart"/>
-      <w:r>
-        <w:rPr>
-          <w:rFonts w:ascii="Arial" w:hAnsi="Arial" w:cs="Arial"/>
-        </w:rPr>
-        <w:t>httpd</w:t>
-      </w:r>
-      <w:proofErr w:type="spellEnd"/>
-      <w:r>
-        <w:rPr>
-          <w:rFonts w:ascii="Arial" w:hAnsi="Arial" w:cs="Arial"/>
-        </w:rPr>
-        <w:t>/</w:t>
-      </w:r>
-      <w:proofErr w:type="spellStart"/>
-      <w:r>
-        <w:rPr>
-          <w:rFonts w:ascii="Arial" w:hAnsi="Arial" w:cs="Arial"/>
-        </w:rPr>
-        <w:t>nginx</w:t>
-      </w:r>
-      <w:proofErr w:type="spellEnd"/>
-      <w:r>
-        <w:rPr>
-          <w:rFonts w:ascii="Arial" w:hAnsi="Arial" w:cs="Arial"/>
-        </w:rPr>
-        <w:t>/java</w:t>
-      </w:r>
-    </w:p>
-    <w:p>
-      <w:pPr>
-        <w:pStyle w:val="Prrafodelista"/>
-        <w:numPr>
-          <w:ilvl w:val="1"/>
-          <w:numId w:val="11"/>
-        </w:numPr>
-        <w:rPr>
-          <w:rFonts w:ascii="Arial" w:hAnsi="Arial" w:cs="Arial"/>
-        </w:rPr>
-      </w:pPr>
-      <w:r>
-        <w:rPr>
-          <w:rFonts w:ascii="Arial" w:hAnsi="Arial" w:cs="Arial"/>
-        </w:rPr>
-        <w:t>Logs recientes de error</w:t>
-      </w:r>
-    </w:p>
-    <w:p>
-      <w:pPr>
-        <w:pStyle w:val="Prrafodelista"/>
-        <w:numPr>
-          <w:ilvl w:val="0"/>
-          <w:numId w:val="11"/>
-        </w:numPr>
-        <w:rPr>
-          <w:rFonts w:ascii="Arial" w:hAnsi="Arial" w:cs="Arial"/>
-        </w:rPr>
-      </w:pPr>
-      <w:r>
-        <w:rPr>
-          <w:rFonts w:ascii="Arial" w:hAnsi="Arial" w:cs="Arial"/>
-        </w:rPr>
-        <w:t>La opción -r (revisar) permite:</w:t>
-      </w:r>
-    </w:p>
-    <w:p>
-      <w:pPr>
-        <w:pStyle w:val="Prrafodelista"/>
-        <w:numPr>
-          <w:ilvl w:val="1"/>
-          <w:numId w:val="11"/>
-        </w:numPr>
-        <w:rPr>
-          <w:rFonts w:ascii="Arial" w:hAnsi="Arial" w:cs="Arial"/>
-        </w:rPr>
-      </w:pPr>
-      <w:r>
-        <w:rPr>
-          <w:rFonts w:ascii="Arial" w:hAnsi="Arial" w:cs="Arial"/>
-        </w:rPr>
-        <w:t>Ingresar IP y puerto para probar</w:t>
-      </w:r>
-    </w:p>
-    <w:p>
-      <w:pPr>
-        <w:pStyle w:val="Prrafodelista"/>
-        <w:numPr>
-          <w:ilvl w:val="1"/>
-          <w:numId w:val="11"/>
-        </w:numPr>
-        <w:rPr>
-          <w:rFonts w:ascii="Arial" w:hAnsi="Arial" w:cs="Arial"/>
-        </w:rPr>
-      </w:pPr>
-      <w:r>
-        <w:rPr>
-          <w:rFonts w:ascii="Arial" w:hAnsi="Arial" w:cs="Arial"/>
-        </w:rPr>
-        <w:t xml:space="preserve">Ejecuta </w:t>
-      </w:r>
-      <w:proofErr w:type="spellStart"/>
-      <w:r>
-        <w:rPr>
-          <w:rFonts w:ascii="Arial" w:hAnsi="Arial" w:cs="Arial"/>
-        </w:rPr>
-        <w:t>curl</w:t>
-      </w:r>
-      <w:proofErr w:type="spellEnd"/>
-      <w:r>
-        <w:rPr>
-          <w:rFonts w:ascii="Arial" w:hAnsi="Arial" w:cs="Arial"/>
-        </w:rPr>
-        <w:t xml:space="preserve"> -I para ver </w:t>
-      </w:r>
-      <w:proofErr w:type="spellStart"/>
-      <w:r>
-        <w:rPr>
-          <w:rFonts w:ascii="Arial" w:hAnsi="Arial" w:cs="Arial"/>
-        </w:rPr>
-        <w:t>headers</w:t>
-      </w:r>
-      <w:proofErr w:type="spellEnd"/>
-      <w:r>
-        <w:rPr>
-          <w:rFonts w:ascii="Arial" w:hAnsi="Arial" w:cs="Arial"/>
-        </w:rPr>
-        <w:t xml:space="preserve"> de respuesta</w:t>
-      </w:r>
-    </w:p>
-    <w:p>
-      <w:pPr>
-        <w:pStyle w:val="Prrafodelista"/>
-        <w:numPr>
-          <w:ilvl w:val="1"/>
-          <w:numId w:val="11"/>
-        </w:numPr>
-        <w:rPr>
-          <w:rFonts w:ascii="Arial" w:hAnsi="Arial" w:cs="Arial"/>
-        </w:rPr>
-      </w:pPr>
-      <w:r>
-        <w:rPr>
-          <w:rFonts w:ascii="Arial" w:hAnsi="Arial" w:cs="Arial"/>
-        </w:rPr>
-        <w:t xml:space="preserve">Valida </w:t>
-      </w:r>
-      <w:proofErr w:type="spellStart"/>
-      <w:r>
-        <w:rPr>
-          <w:rFonts w:ascii="Arial" w:hAnsi="Arial" w:cs="Arial"/>
-        </w:rPr>
-        <w:t>headers</w:t>
-      </w:r>
-      <w:proofErr w:type="spellEnd"/>
-      <w:r>
-        <w:rPr>
-          <w:rFonts w:ascii="Arial" w:hAnsi="Arial" w:cs="Arial"/>
-        </w:rPr>
-        <w:t xml:space="preserve"> de seguridad configurados</w:t>
-      </w:r>
-    </w:p>
-    <w:p>
-      <w:pPr>
-        <w:pStyle w:val="Prrafodelista"/>
-        <w:numPr>
-          <w:ilvl w:val="1"/>
-          <w:numId w:val="11"/>
-        </w:numPr>
-        <w:rPr>
-          <w:rFonts w:ascii="Arial" w:hAnsi="Arial" w:cs="Arial"/>
-        </w:rPr>
-      </w:pPr>
-      <w:r>
-        <w:rPr>
-          <w:rFonts w:ascii="Arial" w:hAnsi="Arial" w:cs="Arial"/>
-        </w:rPr>
-        <w:t>Muestra código de estado HTTP y tiempos de respuesta</w:t>
-      </w:r>
+        <w:rPr>
+          <w:rFonts w:ascii="Arial" w:hAnsi="Arial" w:cs="Arial"/>
+        </w:rPr>
+      </w:pPr>
+    </w:p>
+    <w:p>
+      <w:pPr>
+        <w:rPr>
+          <w:rFonts w:ascii="Arial" w:hAnsi="Arial" w:cs="Arial"/>
+        </w:rPr>
+      </w:pPr>
     </w:p>
     <w:p>
       <w:pPr>
@@ -3340,7 +2231,14 @@
           <w:szCs w:val="28"/>
         </w:rPr>
       </w:pPr>
-      <w:r>
+    </w:p>
+    <w:p>
+      <w:pPr>
+        <w:pStyle w:val="Prrafodelista"/>
+        <w:numPr>
+          <w:ilvl w:val="0"/>
+          <w:numId w:val="15"/>
+        </w:numPr>
         <w:rPr>
           <w:rFonts w:ascii="Arial" w:hAnsi="Arial" w:cs="Arial"/>
           <w:b/>
@@ -3348,11 +2246,39 @@
           <w:sz w:val="28"/>
           <w:szCs w:val="28"/>
         </w:rPr>
+      </w:pPr>
+      <w:r>
+        <w:rPr>
+          <w:rFonts w:ascii="Arial" w:hAnsi="Arial" w:cs="Arial"/>
+          <w:sz w:val="28"/>
+          <w:szCs w:val="28"/>
+        </w:rPr>
+        <w:t>Eligiendo Apache2:</w:t>
+      </w:r>
+    </w:p>
+    <w:p>
+      <w:pPr>
+        <w:rPr>
+          <w:rFonts w:ascii="Arial" w:hAnsi="Arial" w:cs="Arial"/>
+          <w:b/>
+          <w:bCs/>
+          <w:sz w:val="28"/>
+          <w:szCs w:val="28"/>
+        </w:rPr>
+      </w:pPr>
+      <w:r>
+        <w:rPr>
+          <w:rFonts w:ascii="Arial" w:hAnsi="Arial" w:cs="Arial"/>
+          <w:b/>
+          <w:bCs/>
+          <w:sz w:val="28"/>
+          <w:szCs w:val="28"/>
+        </w:rPr>
         <w:drawing>
-          <wp:inline distT="0" distB="0" distL="0" distR="0" wp14:anchorId="280B8CA5" wp14:editId="5E1F528F">
-            <wp:extent cx="3419952" cy="1571844"/>
-            <wp:effectExtent l="0" t="0" r="9525" b="9525"/>
-            <wp:docPr id="766132340" name="Imagen 1"/>
+          <wp:inline distT="0" distB="0" distL="0" distR="0" wp14:anchorId="21C31A59" wp14:editId="54D67DC1">
+            <wp:extent cx="2676899" cy="1505160"/>
+            <wp:effectExtent l="0" t="0" r="9525" b="0"/>
+            <wp:docPr id="719707123" name="Imagen 1"/>
             <wp:cNvGraphicFramePr>
               <a:graphicFrameLocks xmlns:a="http://schemas.openxmlformats.org/drawingml/2006/main" noChangeAspect="1"/>
             </wp:cNvGraphicFramePr>
@@ -3360,7 +2286,7 @@
               <a:graphicData uri="http://schemas.openxmlformats.org/drawingml/2006/picture">
                 <pic:pic xmlns:pic="http://schemas.openxmlformats.org/drawingml/2006/picture">
                   <pic:nvPicPr>
-                    <pic:cNvPr id="766132340" name=""/>
+                    <pic:cNvPr id="719707123" name=""/>
                     <pic:cNvPicPr/>
                   </pic:nvPicPr>
                   <pic:blipFill>
@@ -3372,7 +2298,7 @@
                   <pic:spPr>
                     <a:xfrm>
                       <a:off x="0" y="0"/>
-                      <a:ext cx="3419952" cy="1571844"/>
+                      <a:ext cx="2676899" cy="1505160"/>
                     </a:xfrm>
                     <a:prstGeom prst="rect">
                       <a:avLst/>
@@ -3406,32 +2332,46 @@
           <w:sz w:val="28"/>
           <w:szCs w:val="28"/>
         </w:rPr>
-        <w:t>Eligiendo Apache2:</w:t>
-      </w:r>
-    </w:p>
-    <w:p>
-      <w:pPr>
-        <w:rPr>
-          <w:rFonts w:ascii="Arial" w:hAnsi="Arial" w:cs="Arial"/>
-          <w:b/>
-          <w:bCs/>
+        <w:t xml:space="preserve">Eligiendo </w:t>
+      </w:r>
+      <w:proofErr w:type="spellStart"/>
+      <w:r>
+        <w:rPr>
+          <w:rFonts w:ascii="Arial" w:hAnsi="Arial" w:cs="Arial"/>
           <w:sz w:val="28"/>
           <w:szCs w:val="28"/>
         </w:rPr>
-      </w:pPr>
-      <w:r>
-        <w:rPr>
-          <w:rFonts w:ascii="Arial" w:hAnsi="Arial" w:cs="Arial"/>
-          <w:b/>
-          <w:bCs/>
+        <w:t>opcion</w:t>
+      </w:r>
+      <w:proofErr w:type="spellEnd"/>
+      <w:r>
+        <w:rPr>
+          <w:rFonts w:ascii="Arial" w:hAnsi="Arial" w:cs="Arial"/>
           <w:sz w:val="28"/>
           <w:szCs w:val="28"/>
         </w:rPr>
+        <w:t xml:space="preserve"> 1:</w:t>
+      </w:r>
+    </w:p>
+    <w:p>
+      <w:pPr>
+        <w:rPr>
+          <w:rFonts w:ascii="Arial" w:hAnsi="Arial" w:cs="Arial"/>
+          <w:sz w:val="28"/>
+          <w:szCs w:val="28"/>
+        </w:rPr>
+      </w:pPr>
+      <w:r>
+        <w:rPr>
+          <w:rFonts w:ascii="Arial" w:hAnsi="Arial" w:cs="Arial"/>
+          <w:sz w:val="28"/>
+          <w:szCs w:val="28"/>
+        </w:rPr>
         <w:drawing>
-          <wp:inline distT="0" distB="0" distL="0" distR="0" wp14:anchorId="6345C0B9" wp14:editId="05FF56CC">
-            <wp:extent cx="3543795" cy="1238423"/>
-            <wp:effectExtent l="0" t="0" r="0" b="0"/>
-            <wp:docPr id="848947138" name="Imagen 1"/>
+          <wp:inline distT="0" distB="0" distL="0" distR="0" wp14:anchorId="3C9F4234" wp14:editId="44BB9FC7">
+            <wp:extent cx="3553321" cy="2495898"/>
+            <wp:effectExtent l="0" t="0" r="9525" b="0"/>
+            <wp:docPr id="543236016" name="Imagen 1"/>
             <wp:cNvGraphicFramePr>
               <a:graphicFrameLocks xmlns:a="http://schemas.openxmlformats.org/drawingml/2006/main" noChangeAspect="1"/>
             </wp:cNvGraphicFramePr>
@@ -3439,7 +2379,7 @@
               <a:graphicData uri="http://schemas.openxmlformats.org/drawingml/2006/picture">
                 <pic:pic xmlns:pic="http://schemas.openxmlformats.org/drawingml/2006/picture">
                   <pic:nvPicPr>
-                    <pic:cNvPr id="848947138" name=""/>
+                    <pic:cNvPr id="543236016" name=""/>
                     <pic:cNvPicPr/>
                   </pic:nvPicPr>
                   <pic:blipFill>
@@ -3451,7 +2391,7 @@
                   <pic:spPr>
                     <a:xfrm>
                       <a:off x="0" y="0"/>
-                      <a:ext cx="3543795" cy="1238423"/>
+                      <a:ext cx="3553321" cy="2495898"/>
                     </a:xfrm>
                     <a:prstGeom prst="rect">
                       <a:avLst/>
@@ -3466,6 +2406,60 @@
     </w:p>
     <w:p>
       <w:pPr>
+        <w:rPr>
+          <w:rFonts w:ascii="Arial" w:hAnsi="Arial" w:cs="Arial"/>
+          <w:sz w:val="28"/>
+          <w:szCs w:val="28"/>
+        </w:rPr>
+      </w:pPr>
+    </w:p>
+    <w:p>
+      <w:pPr>
+        <w:rPr>
+          <w:rFonts w:ascii="Arial" w:hAnsi="Arial" w:cs="Arial"/>
+          <w:sz w:val="28"/>
+          <w:szCs w:val="28"/>
+        </w:rPr>
+      </w:pPr>
+    </w:p>
+    <w:p>
+      <w:pPr>
+        <w:rPr>
+          <w:rFonts w:ascii="Arial" w:hAnsi="Arial" w:cs="Arial"/>
+          <w:sz w:val="28"/>
+          <w:szCs w:val="28"/>
+        </w:rPr>
+      </w:pPr>
+    </w:p>
+    <w:p>
+      <w:pPr>
+        <w:rPr>
+          <w:rFonts w:ascii="Arial" w:hAnsi="Arial" w:cs="Arial"/>
+          <w:sz w:val="28"/>
+          <w:szCs w:val="28"/>
+        </w:rPr>
+      </w:pPr>
+    </w:p>
+    <w:p>
+      <w:pPr>
+        <w:rPr>
+          <w:rFonts w:ascii="Arial" w:hAnsi="Arial" w:cs="Arial"/>
+          <w:sz w:val="28"/>
+          <w:szCs w:val="28"/>
+        </w:rPr>
+      </w:pPr>
+    </w:p>
+    <w:p>
+      <w:pPr>
+        <w:rPr>
+          <w:rFonts w:ascii="Arial" w:hAnsi="Arial" w:cs="Arial"/>
+          <w:sz w:val="28"/>
+          <w:szCs w:val="28"/>
+        </w:rPr>
+      </w:pPr>
+    </w:p>
+    <w:p>
+      <w:pPr>
         <w:pStyle w:val="Prrafodelista"/>
         <w:numPr>
           <w:ilvl w:val="0"/>
@@ -3473,8 +2467,6 @@
         </w:numPr>
         <w:rPr>
           <w:rFonts w:ascii="Arial" w:hAnsi="Arial" w:cs="Arial"/>
-          <w:b/>
-          <w:bCs/>
           <w:sz w:val="28"/>
           <w:szCs w:val="28"/>
         </w:rPr>
@@ -3485,46 +2477,37 @@
           <w:sz w:val="28"/>
           <w:szCs w:val="28"/>
         </w:rPr>
-        <w:t xml:space="preserve">Eligiendo </w:t>
-      </w:r>
-      <w:proofErr w:type="spellStart"/>
+        <w:lastRenderedPageBreak/>
+        <w:t>Repositorio privado</w:t>
+      </w:r>
       <w:r>
         <w:rPr>
           <w:rFonts w:ascii="Arial" w:hAnsi="Arial" w:cs="Arial"/>
           <w:sz w:val="28"/>
           <w:szCs w:val="28"/>
         </w:rPr>
-        <w:t>opcion</w:t>
-      </w:r>
-      <w:proofErr w:type="spellEnd"/>
-      <w:r>
+        <w:t>:</w:t>
+      </w:r>
+    </w:p>
+    <w:p>
+      <w:pPr>
         <w:rPr>
           <w:rFonts w:ascii="Arial" w:hAnsi="Arial" w:cs="Arial"/>
           <w:sz w:val="28"/>
           <w:szCs w:val="28"/>
         </w:rPr>
-        <w:t xml:space="preserve"> 1:</w:t>
-      </w:r>
-    </w:p>
-    <w:p>
-      <w:pPr>
+      </w:pPr>
+      <w:r>
         <w:rPr>
           <w:rFonts w:ascii="Arial" w:hAnsi="Arial" w:cs="Arial"/>
           <w:sz w:val="28"/>
           <w:szCs w:val="28"/>
         </w:rPr>
-      </w:pPr>
-      <w:r>
-        <w:rPr>
-          <w:rFonts w:ascii="Arial" w:hAnsi="Arial" w:cs="Arial"/>
-          <w:sz w:val="28"/>
-          <w:szCs w:val="28"/>
-        </w:rPr>
         <w:drawing>
-          <wp:inline distT="0" distB="0" distL="0" distR="0" wp14:anchorId="759D537E" wp14:editId="2F98FFFC">
-            <wp:extent cx="4829849" cy="1352739"/>
-            <wp:effectExtent l="0" t="0" r="0" b="0"/>
-            <wp:docPr id="1543008598" name="Imagen 1"/>
+          <wp:inline distT="0" distB="0" distL="0" distR="0" wp14:anchorId="4ED5CEEE" wp14:editId="7B7071E6">
+            <wp:extent cx="3458058" cy="3867690"/>
+            <wp:effectExtent l="0" t="0" r="9525" b="0"/>
+            <wp:docPr id="2102789225" name="Imagen 1"/>
             <wp:cNvGraphicFramePr>
               <a:graphicFrameLocks xmlns:a="http://schemas.openxmlformats.org/drawingml/2006/main" noChangeAspect="1"/>
             </wp:cNvGraphicFramePr>
@@ -3532,7 +2515,7 @@
               <a:graphicData uri="http://schemas.openxmlformats.org/drawingml/2006/picture">
                 <pic:pic xmlns:pic="http://schemas.openxmlformats.org/drawingml/2006/picture">
                   <pic:nvPicPr>
-                    <pic:cNvPr id="1543008598" name=""/>
+                    <pic:cNvPr id="2102789225" name=""/>
                     <pic:cNvPicPr/>
                   </pic:nvPicPr>
                   <pic:blipFill>
@@ -3544,7 +2527,7 @@
                   <pic:spPr>
                     <a:xfrm>
                       <a:off x="0" y="0"/>
-                      <a:ext cx="4829849" cy="1352739"/>
+                      <a:ext cx="3458058" cy="3867690"/>
                     </a:xfrm>
                     <a:prstGeom prst="rect">
                       <a:avLst/>
@@ -3559,60 +2542,6 @@
     </w:p>
     <w:p>
       <w:pPr>
-        <w:rPr>
-          <w:rFonts w:ascii="Arial" w:hAnsi="Arial" w:cs="Arial"/>
-          <w:sz w:val="28"/>
-          <w:szCs w:val="28"/>
-        </w:rPr>
-      </w:pPr>
-    </w:p>
-    <w:p>
-      <w:pPr>
-        <w:rPr>
-          <w:rFonts w:ascii="Arial" w:hAnsi="Arial" w:cs="Arial"/>
-          <w:sz w:val="28"/>
-          <w:szCs w:val="28"/>
-        </w:rPr>
-      </w:pPr>
-    </w:p>
-    <w:p>
-      <w:pPr>
-        <w:rPr>
-          <w:rFonts w:ascii="Arial" w:hAnsi="Arial" w:cs="Arial"/>
-          <w:sz w:val="28"/>
-          <w:szCs w:val="28"/>
-        </w:rPr>
-      </w:pPr>
-    </w:p>
-    <w:p>
-      <w:pPr>
-        <w:rPr>
-          <w:rFonts w:ascii="Arial" w:hAnsi="Arial" w:cs="Arial"/>
-          <w:sz w:val="28"/>
-          <w:szCs w:val="28"/>
-        </w:rPr>
-      </w:pPr>
-    </w:p>
-    <w:p>
-      <w:pPr>
-        <w:rPr>
-          <w:rFonts w:ascii="Arial" w:hAnsi="Arial" w:cs="Arial"/>
-          <w:sz w:val="28"/>
-          <w:szCs w:val="28"/>
-        </w:rPr>
-      </w:pPr>
-    </w:p>
-    <w:p>
-      <w:pPr>
-        <w:rPr>
-          <w:rFonts w:ascii="Arial" w:hAnsi="Arial" w:cs="Arial"/>
-          <w:sz w:val="28"/>
-          <w:szCs w:val="28"/>
-        </w:rPr>
-      </w:pPr>
-    </w:p>
-    <w:p>
-      <w:pPr>
         <w:pStyle w:val="Prrafodelista"/>
         <w:numPr>
           <w:ilvl w:val="0"/>
@@ -3630,8 +2559,7 @@
           <w:sz w:val="28"/>
           <w:szCs w:val="28"/>
         </w:rPr>
-        <w:lastRenderedPageBreak/>
-        <w:t>Dejando por defecto:</w:t>
+        <w:t>instalación completa</w:t>
       </w:r>
     </w:p>
     <w:p>
@@ -3649,10 +2577,10 @@
           <w:szCs w:val="28"/>
         </w:rPr>
         <w:drawing>
-          <wp:inline distT="0" distB="0" distL="0" distR="0" wp14:anchorId="7E8EFDAF" wp14:editId="245589DA">
-            <wp:extent cx="5612130" cy="3442335"/>
-            <wp:effectExtent l="0" t="0" r="7620" b="5715"/>
-            <wp:docPr id="689585097" name="Imagen 1"/>
+          <wp:inline distT="0" distB="0" distL="0" distR="0" wp14:anchorId="7D830E00" wp14:editId="774D52C2">
+            <wp:extent cx="3212998" cy="3296093"/>
+            <wp:effectExtent l="0" t="0" r="6985" b="0"/>
+            <wp:docPr id="643820554" name="Imagen 1"/>
             <wp:cNvGraphicFramePr>
               <a:graphicFrameLocks xmlns:a="http://schemas.openxmlformats.org/drawingml/2006/main" noChangeAspect="1"/>
             </wp:cNvGraphicFramePr>
@@ -3660,7 +2588,7 @@
               <a:graphicData uri="http://schemas.openxmlformats.org/drawingml/2006/picture">
                 <pic:pic xmlns:pic="http://schemas.openxmlformats.org/drawingml/2006/picture">
                   <pic:nvPicPr>
-                    <pic:cNvPr id="689585097" name=""/>
+                    <pic:cNvPr id="643820554" name=""/>
                     <pic:cNvPicPr/>
                   </pic:nvPicPr>
                   <pic:blipFill>
@@ -3672,7 +2600,7 @@
                   <pic:spPr>
                     <a:xfrm>
                       <a:off x="0" y="0"/>
-                      <a:ext cx="5612130" cy="3442335"/>
+                      <a:ext cx="3218793" cy="3302038"/>
                     </a:xfrm>
                     <a:prstGeom prst="rect">
                       <a:avLst/>
@@ -3704,7 +2632,8 @@
           <w:sz w:val="28"/>
           <w:szCs w:val="28"/>
         </w:rPr>
-        <w:t>Pruebas del servicio desde la maquina host:</w:t>
+        <w:lastRenderedPageBreak/>
+        <w:t>Pruebas</w:t>
       </w:r>
     </w:p>
     <w:p>
@@ -3722,10 +2651,10 @@
           <w:szCs w:val="28"/>
         </w:rPr>
         <w:drawing>
-          <wp:inline distT="0" distB="0" distL="0" distR="0" wp14:anchorId="3A6E8FD6" wp14:editId="6972E936">
-            <wp:extent cx="5612130" cy="1662430"/>
+          <wp:inline distT="0" distB="0" distL="0" distR="0" wp14:anchorId="3C9551C1" wp14:editId="0EBC2FD4">
+            <wp:extent cx="5612130" cy="1815465"/>
             <wp:effectExtent l="0" t="0" r="7620" b="0"/>
-            <wp:docPr id="648278659" name="Imagen 1"/>
+            <wp:docPr id="2041541876" name="Imagen 1"/>
             <wp:cNvGraphicFramePr>
               <a:graphicFrameLocks xmlns:a="http://schemas.openxmlformats.org/drawingml/2006/main" noChangeAspect="1"/>
             </wp:cNvGraphicFramePr>
@@ -3733,7 +2662,7 @@
               <a:graphicData uri="http://schemas.openxmlformats.org/drawingml/2006/picture">
                 <pic:pic xmlns:pic="http://schemas.openxmlformats.org/drawingml/2006/picture">
                   <pic:nvPicPr>
-                    <pic:cNvPr id="648278659" name=""/>
+                    <pic:cNvPr id="2041541876" name=""/>
                     <pic:cNvPicPr/>
                   </pic:nvPicPr>
                   <pic:blipFill>
@@ -3745,7 +2674,7 @@
                   <pic:spPr>
                     <a:xfrm>
                       <a:off x="0" y="0"/>
-                      <a:ext cx="5612130" cy="1662430"/>
+                      <a:ext cx="5612130" cy="1815465"/>
                     </a:xfrm>
                     <a:prstGeom prst="rect">
                       <a:avLst/>
@@ -3825,7 +2754,6 @@
           <w:sz w:val="28"/>
           <w:szCs w:val="28"/>
         </w:rPr>
-        <w:lastRenderedPageBreak/>
         <w:t>Conclusiones y Referencias</w:t>
       </w:r>
     </w:p>
@@ -4580,6 +3508,155 @@
     </w:lvl>
   </w:abstractNum>
   <w:abstractNum w:abstractNumId="6" w15:restartNumberingAfterBreak="0">
+    <w:nsid w:val="2F85447E"/>
+    <w:multiLevelType w:val="multilevel"/>
+    <w:tmpl w:val="A392AAA8"/>
+    <w:lvl w:ilvl="0">
+      <w:start w:val="1"/>
+      <w:numFmt w:val="bullet"/>
+      <w:lvlText w:val=""/>
+      <w:lvlJc w:val="left"/>
+      <w:pPr>
+        <w:tabs>
+          <w:tab w:val="num" w:pos="720"/>
+        </w:tabs>
+        <w:ind w:left="720" w:hanging="360"/>
+      </w:pPr>
+      <w:rPr>
+        <w:rFonts w:ascii="Symbol" w:hAnsi="Symbol" w:hint="default"/>
+        <w:sz w:val="20"/>
+      </w:rPr>
+    </w:lvl>
+    <w:lvl w:ilvl="1" w:tentative="1">
+      <w:start w:val="1"/>
+      <w:numFmt w:val="bullet"/>
+      <w:lvlText w:val="o"/>
+      <w:lvlJc w:val="left"/>
+      <w:pPr>
+        <w:tabs>
+          <w:tab w:val="num" w:pos="1440"/>
+        </w:tabs>
+        <w:ind w:left="1440" w:hanging="360"/>
+      </w:pPr>
+      <w:rPr>
+        <w:rFonts w:ascii="Courier New" w:hAnsi="Courier New" w:hint="default"/>
+        <w:sz w:val="20"/>
+      </w:rPr>
+    </w:lvl>
+    <w:lvl w:ilvl="2" w:tentative="1">
+      <w:start w:val="1"/>
+      <w:numFmt w:val="bullet"/>
+      <w:lvlText w:val=""/>
+      <w:lvlJc w:val="left"/>
+      <w:pPr>
+        <w:tabs>
+          <w:tab w:val="num" w:pos="2160"/>
+        </w:tabs>
+        <w:ind w:left="2160" w:hanging="360"/>
+      </w:pPr>
+      <w:rPr>
+        <w:rFonts w:ascii="Wingdings" w:hAnsi="Wingdings" w:hint="default"/>
+        <w:sz w:val="20"/>
+      </w:rPr>
+    </w:lvl>
+    <w:lvl w:ilvl="3" w:tentative="1">
+      <w:start w:val="1"/>
+      <w:numFmt w:val="bullet"/>
+      <w:lvlText w:val=""/>
+      <w:lvlJc w:val="left"/>
+      <w:pPr>
+        <w:tabs>
+          <w:tab w:val="num" w:pos="2880"/>
+        </w:tabs>
+        <w:ind w:left="2880" w:hanging="360"/>
+      </w:pPr>
+      <w:rPr>
+        <w:rFonts w:ascii="Wingdings" w:hAnsi="Wingdings" w:hint="default"/>
+        <w:sz w:val="20"/>
+      </w:rPr>
+    </w:lvl>
+    <w:lvl w:ilvl="4" w:tentative="1">
+      <w:start w:val="1"/>
+      <w:numFmt w:val="bullet"/>
+      <w:lvlText w:val=""/>
+      <w:lvlJc w:val="left"/>
+      <w:pPr>
+        <w:tabs>
+          <w:tab w:val="num" w:pos="3600"/>
+        </w:tabs>
+        <w:ind w:left="3600" w:hanging="360"/>
+      </w:pPr>
+      <w:rPr>
+        <w:rFonts w:ascii="Wingdings" w:hAnsi="Wingdings" w:hint="default"/>
+        <w:sz w:val="20"/>
+      </w:rPr>
+    </w:lvl>
+    <w:lvl w:ilvl="5" w:tentative="1">
+      <w:start w:val="1"/>
+      <w:numFmt w:val="bullet"/>
+      <w:lvlText w:val=""/>
+      <w:lvlJc w:val="left"/>
+      <w:pPr>
+        <w:tabs>
+          <w:tab w:val="num" w:pos="4320"/>
+        </w:tabs>
+        <w:ind w:left="4320" w:hanging="360"/>
+      </w:pPr>
+      <w:rPr>
+        <w:rFonts w:ascii="Wingdings" w:hAnsi="Wingdings" w:hint="default"/>
+        <w:sz w:val="20"/>
+      </w:rPr>
+    </w:lvl>
+    <w:lvl w:ilvl="6" w:tentative="1">
+      <w:start w:val="1"/>
+      <w:numFmt w:val="bullet"/>
+      <w:lvlText w:val=""/>
+      <w:lvlJc w:val="left"/>
+      <w:pPr>
+        <w:tabs>
+          <w:tab w:val="num" w:pos="5040"/>
+        </w:tabs>
+        <w:ind w:left="5040" w:hanging="360"/>
+      </w:pPr>
+      <w:rPr>
+        <w:rFonts w:ascii="Wingdings" w:hAnsi="Wingdings" w:hint="default"/>
+        <w:sz w:val="20"/>
+      </w:rPr>
+    </w:lvl>
+    <w:lvl w:ilvl="7" w:tentative="1">
+      <w:start w:val="1"/>
+      <w:numFmt w:val="bullet"/>
+      <w:lvlText w:val=""/>
+      <w:lvlJc w:val="left"/>
+      <w:pPr>
+        <w:tabs>
+          <w:tab w:val="num" w:pos="5760"/>
+        </w:tabs>
+        <w:ind w:left="5760" w:hanging="360"/>
+      </w:pPr>
+      <w:rPr>
+        <w:rFonts w:ascii="Wingdings" w:hAnsi="Wingdings" w:hint="default"/>
+        <w:sz w:val="20"/>
+      </w:rPr>
+    </w:lvl>
+    <w:lvl w:ilvl="8" w:tentative="1">
+      <w:start w:val="1"/>
+      <w:numFmt w:val="bullet"/>
+      <w:lvlText w:val=""/>
+      <w:lvlJc w:val="left"/>
+      <w:pPr>
+        <w:tabs>
+          <w:tab w:val="num" w:pos="6480"/>
+        </w:tabs>
+        <w:ind w:left="6480" w:hanging="360"/>
+      </w:pPr>
+      <w:rPr>
+        <w:rFonts w:ascii="Wingdings" w:hAnsi="Wingdings" w:hint="default"/>
+        <w:sz w:val="20"/>
+      </w:rPr>
+    </w:lvl>
+  </w:abstractNum>
+  <w:abstractNum w:abstractNumId="7" w15:restartNumberingAfterBreak="0">
     <w:nsid w:val="3127605E"/>
     <w:multiLevelType w:val="hybridMultilevel"/>
     <w:tmpl w:val="DA241474"/>
@@ -4668,7 +3745,7 @@
       </w:pPr>
     </w:lvl>
   </w:abstractNum>
-  <w:abstractNum w:abstractNumId="7" w15:restartNumberingAfterBreak="0">
+  <w:abstractNum w:abstractNumId="8" w15:restartNumberingAfterBreak="0">
     <w:nsid w:val="33742A5A"/>
     <w:multiLevelType w:val="hybridMultilevel"/>
     <w:tmpl w:val="BF28E0EA"/>
@@ -4760,7 +3837,124 @@
       </w:pPr>
     </w:lvl>
   </w:abstractNum>
-  <w:abstractNum w:abstractNumId="8" w15:restartNumberingAfterBreak="0">
+  <w:abstractNum w:abstractNumId="9" w15:restartNumberingAfterBreak="0">
+    <w:nsid w:val="41506E5A"/>
+    <w:multiLevelType w:val="multilevel"/>
+    <w:tmpl w:val="81D0AC1C"/>
+    <w:lvl w:ilvl="0">
+      <w:start w:val="1"/>
+      <w:numFmt w:val="decimal"/>
+      <w:lvlText w:val="%1."/>
+      <w:lvlJc w:val="left"/>
+      <w:pPr>
+        <w:tabs>
+          <w:tab w:val="num" w:pos="720"/>
+        </w:tabs>
+        <w:ind w:left="720" w:hanging="360"/>
+      </w:pPr>
+    </w:lvl>
+    <w:lvl w:ilvl="1">
+      <w:start w:val="1"/>
+      <w:numFmt w:val="bullet"/>
+      <w:lvlText w:val="o"/>
+      <w:lvlJc w:val="left"/>
+      <w:pPr>
+        <w:tabs>
+          <w:tab w:val="num" w:pos="1440"/>
+        </w:tabs>
+        <w:ind w:left="1440" w:hanging="360"/>
+      </w:pPr>
+      <w:rPr>
+        <w:rFonts w:ascii="Courier New" w:hAnsi="Courier New" w:hint="default"/>
+        <w:sz w:val="20"/>
+      </w:rPr>
+    </w:lvl>
+    <w:lvl w:ilvl="2" w:tentative="1">
+      <w:start w:val="1"/>
+      <w:numFmt w:val="decimal"/>
+      <w:lvlText w:val="%3."/>
+      <w:lvlJc w:val="left"/>
+      <w:pPr>
+        <w:tabs>
+          <w:tab w:val="num" w:pos="2160"/>
+        </w:tabs>
+        <w:ind w:left="2160" w:hanging="360"/>
+      </w:pPr>
+    </w:lvl>
+    <w:lvl w:ilvl="3" w:tentative="1">
+      <w:start w:val="1"/>
+      <w:numFmt w:val="decimal"/>
+      <w:lvlText w:val="%4."/>
+      <w:lvlJc w:val="left"/>
+      <w:pPr>
+        <w:tabs>
+          <w:tab w:val="num" w:pos="2880"/>
+        </w:tabs>
+        <w:ind w:left="2880" w:hanging="360"/>
+      </w:pPr>
+    </w:lvl>
+    <w:lvl w:ilvl="4" w:tentative="1">
+      <w:start w:val="1"/>
+      <w:numFmt w:val="decimal"/>
+      <w:lvlText w:val="%5."/>
+      <w:lvlJc w:val="left"/>
+      <w:pPr>
+        <w:tabs>
+          <w:tab w:val="num" w:pos="3600"/>
+        </w:tabs>
+        <w:ind w:left="3600" w:hanging="360"/>
+      </w:pPr>
+    </w:lvl>
+    <w:lvl w:ilvl="5" w:tentative="1">
+      <w:start w:val="1"/>
+      <w:numFmt w:val="decimal"/>
+      <w:lvlText w:val="%6."/>
+      <w:lvlJc w:val="left"/>
+      <w:pPr>
+        <w:tabs>
+          <w:tab w:val="num" w:pos="4320"/>
+        </w:tabs>
+        <w:ind w:left="4320" w:hanging="360"/>
+      </w:pPr>
+    </w:lvl>
+    <w:lvl w:ilvl="6" w:tentative="1">
+      <w:start w:val="1"/>
+      <w:numFmt w:val="decimal"/>
+      <w:lvlText w:val="%7."/>
+      <w:lvlJc w:val="left"/>
+      <w:pPr>
+        <w:tabs>
+          <w:tab w:val="num" w:pos="5040"/>
+        </w:tabs>
+        <w:ind w:left="5040" w:hanging="360"/>
+      </w:pPr>
+    </w:lvl>
+    <w:lvl w:ilvl="7" w:tentative="1">
+      <w:start w:val="1"/>
+      <w:numFmt w:val="decimal"/>
+      <w:lvlText w:val="%8."/>
+      <w:lvlJc w:val="left"/>
+      <w:pPr>
+        <w:tabs>
+          <w:tab w:val="num" w:pos="5760"/>
+        </w:tabs>
+        <w:ind w:left="5760" w:hanging="360"/>
+      </w:pPr>
+    </w:lvl>
+    <w:lvl w:ilvl="8" w:tentative="1">
+      <w:start w:val="1"/>
+      <w:numFmt w:val="decimal"/>
+      <w:lvlText w:val="%9."/>
+      <w:lvlJc w:val="left"/>
+      <w:pPr>
+        <w:tabs>
+          <w:tab w:val="num" w:pos="6480"/>
+        </w:tabs>
+        <w:ind w:left="6480" w:hanging="360"/>
+      </w:pPr>
+    </w:lvl>
+  </w:abstractNum>
+  <w:abstractNum w:abstractNumId="10" w15:restartNumberingAfterBreak="0">
     <w:nsid w:val="41DD73FF"/>
     <w:multiLevelType w:val="hybridMultilevel"/>
     <w:tmpl w:val="BEE4E91A"/>
@@ -4846,7 +4040,7 @@
       </w:pPr>
     </w:lvl>
   </w:abstractNum>
-  <w:abstractNum w:abstractNumId="9" w15:restartNumberingAfterBreak="0">
+  <w:abstractNum w:abstractNumId="11" w15:restartNumberingAfterBreak="0">
     <w:nsid w:val="5A274C84"/>
     <w:multiLevelType w:val="hybridMultilevel"/>
     <w:tmpl w:val="26B2E358"/>
@@ -4935,7 +4129,124 @@
       </w:pPr>
     </w:lvl>
   </w:abstractNum>
-  <w:abstractNum w:abstractNumId="10" w15:restartNumberingAfterBreak="0">
+  <w:abstractNum w:abstractNumId="12" w15:restartNumberingAfterBreak="0">
+    <w:nsid w:val="5CE45EBB"/>
+    <w:multiLevelType w:val="multilevel"/>
+    <w:tmpl w:val="F31E4F2C"/>
+    <w:lvl w:ilvl="0">
+      <w:start w:val="1"/>
+      <w:numFmt w:val="decimal"/>
+      <w:lvlText w:val="%1."/>
+      <w:lvlJc w:val="left"/>
+      <w:pPr>
+        <w:tabs>
+          <w:tab w:val="num" w:pos="720"/>
+        </w:tabs>
+        <w:ind w:left="720" w:hanging="360"/>
+      </w:pPr>
+    </w:lvl>
+    <w:lvl w:ilvl="1">
+      <w:start w:val="1"/>
+      <w:numFmt w:val="bullet"/>
+      <w:lvlText w:val="o"/>
+      <w:lvlJc w:val="left"/>
+      <w:pPr>
+        <w:tabs>
+          <w:tab w:val="num" w:pos="1440"/>
+        </w:tabs>
+        <w:ind w:left="1440" w:hanging="360"/>
+      </w:pPr>
+      <w:rPr>
+        <w:rFonts w:ascii="Courier New" w:hAnsi="Courier New" w:hint="default"/>
+        <w:sz w:val="20"/>
+      </w:rPr>
+    </w:lvl>
+    <w:lvl w:ilvl="2" w:tentative="1">
+      <w:start w:val="1"/>
+      <w:numFmt w:val="decimal"/>
+      <w:lvlText w:val="%3."/>
+      <w:lvlJc w:val="left"/>
+      <w:pPr>
+        <w:tabs>
+          <w:tab w:val="num" w:pos="2160"/>
+        </w:tabs>
+        <w:ind w:left="2160" w:hanging="360"/>
+      </w:pPr>
+    </w:lvl>
+    <w:lvl w:ilvl="3" w:tentative="1">
+      <w:start w:val="1"/>
+      <w:numFmt w:val="decimal"/>
+      <w:lvlText w:val="%4."/>
+      <w:lvlJc w:val="left"/>
+      <w:pPr>
+        <w:tabs>
+          <w:tab w:val="num" w:pos="2880"/>
+        </w:tabs>
+        <w:ind w:left="2880" w:hanging="360"/>
+      </w:pPr>
+    </w:lvl>
+    <w:lvl w:ilvl="4" w:tentative="1">
+      <w:start w:val="1"/>
+      <w:numFmt w:val="decimal"/>
+      <w:lvlText w:val="%5."/>
+      <w:lvlJc w:val="left"/>
+      <w:pPr>
+        <w:tabs>
+          <w:tab w:val="num" w:pos="3600"/>
+        </w:tabs>
+        <w:ind w:left="3600" w:hanging="360"/>
+      </w:pPr>
+    </w:lvl>
+    <w:lvl w:ilvl="5" w:tentative="1">
+      <w:start w:val="1"/>
+      <w:numFmt w:val="decimal"/>
+      <w:lvlText w:val="%6."/>
+      <w:lvlJc w:val="left"/>
+      <w:pPr>
+        <w:tabs>
+          <w:tab w:val="num" w:pos="4320"/>
+        </w:tabs>
+        <w:ind w:left="4320" w:hanging="360"/>
+      </w:pPr>
+    </w:lvl>
+    <w:lvl w:ilvl="6" w:tentative="1">
+      <w:start w:val="1"/>
+      <w:numFmt w:val="decimal"/>
+      <w:lvlText w:val="%7."/>
+      <w:lvlJc w:val="left"/>
+      <w:pPr>
+        <w:tabs>
+          <w:tab w:val="num" w:pos="5040"/>
+        </w:tabs>
+        <w:ind w:left="5040" w:hanging="360"/>
+      </w:pPr>
+    </w:lvl>
+    <w:lvl w:ilvl="7" w:tentative="1">
+      <w:start w:val="1"/>
+      <w:numFmt w:val="decimal"/>
+      <w:lvlText w:val="%8."/>
+      <w:lvlJc w:val="left"/>
+      <w:pPr>
+        <w:tabs>
+          <w:tab w:val="num" w:pos="5760"/>
+        </w:tabs>
+        <w:ind w:left="5760" w:hanging="360"/>
+      </w:pPr>
+    </w:lvl>
+    <w:lvl w:ilvl="8" w:tentative="1">
+      <w:start w:val="1"/>
+      <w:numFmt w:val="decimal"/>
+      <w:lvlText w:val="%9."/>
+      <w:lvlJc w:val="left"/>
+      <w:pPr>
+        <w:tabs>
+          <w:tab w:val="num" w:pos="6480"/>
+        </w:tabs>
+        <w:ind w:left="6480" w:hanging="360"/>
+      </w:pPr>
+    </w:lvl>
+  </w:abstractNum>
+  <w:abstractNum w:abstractNumId="13" w15:restartNumberingAfterBreak="0">
     <w:nsid w:val="5D955784"/>
     <w:multiLevelType w:val="hybridMultilevel"/>
     <w:tmpl w:val="725EDDD2"/>
@@ -5048,7 +4359,7 @@
       </w:rPr>
     </w:lvl>
   </w:abstractNum>
-  <w:abstractNum w:abstractNumId="11" w15:restartNumberingAfterBreak="0">
+  <w:abstractNum w:abstractNumId="14" w15:restartNumberingAfterBreak="0">
     <w:nsid w:val="67AC7D7F"/>
     <w:multiLevelType w:val="hybridMultilevel"/>
     <w:tmpl w:val="ADCAD13E"/>
@@ -5134,7 +4445,7 @@
       </w:pPr>
     </w:lvl>
   </w:abstractNum>
-  <w:abstractNum w:abstractNumId="12" w15:restartNumberingAfterBreak="0">
+  <w:abstractNum w:abstractNumId="15" w15:restartNumberingAfterBreak="0">
     <w:nsid w:val="69FA6795"/>
     <w:multiLevelType w:val="hybridMultilevel"/>
     <w:tmpl w:val="F3F48266"/>
@@ -5247,7 +4558,7 @@
       </w:rPr>
     </w:lvl>
   </w:abstractNum>
-  <w:abstractNum w:abstractNumId="13" w15:restartNumberingAfterBreak="0">
+  <w:abstractNum w:abstractNumId="16" w15:restartNumberingAfterBreak="0">
     <w:nsid w:val="6AFA3A0A"/>
     <w:multiLevelType w:val="hybridMultilevel"/>
     <w:tmpl w:val="64046816"/>
@@ -5336,7 +4647,7 @@
       </w:pPr>
     </w:lvl>
   </w:abstractNum>
-  <w:abstractNum w:abstractNumId="14" w15:restartNumberingAfterBreak="0">
+  <w:abstractNum w:abstractNumId="17" w15:restartNumberingAfterBreak="0">
     <w:nsid w:val="6D1C1737"/>
     <w:multiLevelType w:val="hybridMultilevel"/>
     <w:tmpl w:val="43D22B8A"/>
@@ -5427,22 +4738,22 @@
     </w:lvl>
   </w:abstractNum>
   <w:num w:numId="1" w16cid:durableId="169956279">
-    <w:abstractNumId w:val="6"/>
+    <w:abstractNumId w:val="7"/>
   </w:num>
   <w:num w:numId="2" w16cid:durableId="256671147">
     <w:abstractNumId w:val="4"/>
   </w:num>
   <w:num w:numId="3" w16cid:durableId="1257057186">
-    <w:abstractNumId w:val="14"/>
+    <w:abstractNumId w:val="17"/>
   </w:num>
   <w:num w:numId="4" w16cid:durableId="337970169">
     <w:abstractNumId w:val="2"/>
   </w:num>
   <w:num w:numId="5" w16cid:durableId="831414487">
-    <w:abstractNumId w:val="10"/>
+    <w:abstractNumId w:val="13"/>
   </w:num>
   <w:num w:numId="6" w16cid:durableId="1617057885">
-    <w:abstractNumId w:val="13"/>
+    <w:abstractNumId w:val="16"/>
   </w:num>
   <w:num w:numId="7" w16cid:durableId="1211964534">
     <w:abstractNumId w:val="1"/>
@@ -5451,25 +4762,34 @@
     <w:abstractNumId w:val="0"/>
   </w:num>
   <w:num w:numId="9" w16cid:durableId="1391223319">
-    <w:abstractNumId w:val="7"/>
+    <w:abstractNumId w:val="8"/>
   </w:num>
   <w:num w:numId="10" w16cid:durableId="458652429">
-    <w:abstractNumId w:val="12"/>
+    <w:abstractNumId w:val="15"/>
   </w:num>
   <w:num w:numId="11" w16cid:durableId="607737053">
-    <w:abstractNumId w:val="11"/>
+    <w:abstractNumId w:val="14"/>
   </w:num>
   <w:num w:numId="12" w16cid:durableId="1391345135">
     <w:abstractNumId w:val="3"/>
   </w:num>
   <w:num w:numId="13" w16cid:durableId="1458180038">
-    <w:abstractNumId w:val="8"/>
+    <w:abstractNumId w:val="10"/>
   </w:num>
   <w:num w:numId="14" w16cid:durableId="580916515">
-    <w:abstractNumId w:val="9"/>
+    <w:abstractNumId w:val="11"/>
   </w:num>
   <w:num w:numId="15" w16cid:durableId="487599907">
     <w:abstractNumId w:val="5"/>
+  </w:num>
+  <w:num w:numId="16" w16cid:durableId="767232381">
+    <w:abstractNumId w:val="6"/>
+  </w:num>
+  <w:num w:numId="17" w16cid:durableId="436952371">
+    <w:abstractNumId w:val="9"/>
+  </w:num>
+  <w:num w:numId="18" w16cid:durableId="1745952689">
+    <w:abstractNumId w:val="12"/>
   </w:num>
 </w:numbering>
 </file>

</xml_diff>